<commit_message>
feat: add maze ultrasound and first aid proposals
</commit_message>
<xml_diff>
--- a/output/doc/2026-07-13-microsoft-medical-emoji-decision-brief.docx
+++ b/output/doc/2026-07-13-microsoft-medical-emoji-decision-brief.docx
@@ -1,13 +1,13 @@
 
 <file path=word/document.xml><?xml version="1.0" encoding="utf-8"?>
-<w:document xmlns:w="http://schemas.openxmlformats.org/wordprocessingml/2006/main" xmlns:m="http://schemas.openxmlformats.org/officeDocument/2006/math" xmlns:r="http://schemas.openxmlformats.org/officeDocument/2006/relationships" xmlns:o="urn:schemas-microsoft-com:office:office" xmlns:v="urn:schemas-microsoft-com:vml" xmlns:w10="urn:schemas-microsoft-com:office:word" xmlns:a="http://schemas.openxmlformats.org/drawingml/2006/main" xmlns:pic="http://schemas.openxmlformats.org/drawingml/2006/picture" xmlns:wp="http://schemas.openxmlformats.org/drawingml/2006/wordprocessingDrawing">
+<w:document xmlns:wpc="http://schemas.microsoft.com/office/word/2010/wordprocessingCanvas" xmlns:cx="http://schemas.microsoft.com/office/drawing/2014/chartex" xmlns:cx1="http://schemas.microsoft.com/office/drawing/2015/9/8/chartex" xmlns:cx2="http://schemas.microsoft.com/office/drawing/2015/10/21/chartex" xmlns:cx3="http://schemas.microsoft.com/office/drawing/2016/5/9/chartex" xmlns:cx4="http://schemas.microsoft.com/office/drawing/2016/5/10/chartex" xmlns:cx5="http://schemas.microsoft.com/office/drawing/2016/5/11/chartex" xmlns:cx6="http://schemas.microsoft.com/office/drawing/2016/5/12/chartex" xmlns:cx7="http://schemas.microsoft.com/office/drawing/2016/5/13/chartex" xmlns:cx8="http://schemas.microsoft.com/office/drawing/2016/5/14/chartex" xmlns:mc="http://schemas.openxmlformats.org/markup-compatibility/2006" xmlns:aink="http://schemas.microsoft.com/office/drawing/2016/ink" xmlns:am3d="http://schemas.microsoft.com/office/drawing/2017/model3d" xmlns:o="urn:schemas-microsoft-com:office:office" xmlns:oel="http://schemas.microsoft.com/office/2019/extlst" xmlns:r="http://schemas.openxmlformats.org/officeDocument/2006/relationships" xmlns:m="http://schemas.openxmlformats.org/officeDocument/2006/math" xmlns:v="urn:schemas-microsoft-com:vml" xmlns:wp14="http://schemas.microsoft.com/office/word/2010/wordprocessingDrawing" xmlns:wp="http://schemas.openxmlformats.org/drawingml/2006/wordprocessingDrawing" xmlns:w10="urn:schemas-microsoft-com:office:word" xmlns:w="http://schemas.openxmlformats.org/wordprocessingml/2006/main" xmlns:w14="http://schemas.microsoft.com/office/word/2010/wordml" xmlns:w15="http://schemas.microsoft.com/office/word/2012/wordml" xmlns:w16cex="http://schemas.microsoft.com/office/word/2018/wordml/cex" xmlns:w16cid="http://schemas.microsoft.com/office/word/2016/wordml/cid" xmlns:w16="http://schemas.microsoft.com/office/word/2018/wordml" xmlns:w16du="http://schemas.microsoft.com/office/word/2023/wordml/word16du" xmlns:w16sdtdh="http://schemas.microsoft.com/office/word/2020/wordml/sdtdatahash" xmlns:w16sdtfl="http://schemas.microsoft.com/office/word/2024/wordml/sdtformatlock" xmlns:w16se="http://schemas.microsoft.com/office/word/2015/wordml/symex" xmlns:wpg="http://schemas.microsoft.com/office/word/2010/wordprocessingGroup" xmlns:wpi="http://schemas.microsoft.com/office/word/2010/wordprocessingInk" xmlns:wne="http://schemas.microsoft.com/office/word/2006/wordml" xmlns:wps="http://schemas.microsoft.com/office/word/2010/wordprocessingShape" mc:Ignorable="w14 w15 w16se w16cid w16 w16cex w16sdtdh w16sdtfl w16du wp14">
   <w:body>
     <w:p>
       <w:pPr>
         <w:pStyle w:val="Title"/>
       </w:pPr>
       <w:r>
-        <w:t xml:space="preserve">2026 Medical Emoji: Microsoft Internal Decision Brief</w:t>
+        <w:t>2026 Medical Emoji: Microsoft Internal Decision Brief</w:t>
       </w:r>
     </w:p>
     <w:p>
@@ -15,7 +15,7 @@
         <w:pStyle w:val="Subtitle"/>
       </w:pPr>
       <w:r>
-        <w:t xml:space="preserve">Choose one clearly eligible proposal to advance before July 31</w:t>
+        <w:t>Choose one lead and preserve one filing-ready fallback before July 31</w:t>
       </w:r>
     </w:p>
     <w:p>
@@ -23,7 +23,7 @@
         <w:pStyle w:val="Author"/>
       </w:pPr>
       <w:r>
-        <w:t xml:space="preserve">Prepared for David Rhew, MD, and Vishal Chowdhary</w:t>
+        <w:t>Prepared for David Rhew, MD, and Vishal Chowdhary</w:t>
       </w:r>
     </w:p>
     <w:p>
@@ -31,7 +31,7 @@
         <w:pStyle w:val="Date"/>
       </w:pPr>
       <w:r>
-        <w:t xml:space="preserve">July 13, 2026</w:t>
+        <w:t>July 13, 2026</w:t>
       </w:r>
     </w:p>
     <w:p>
@@ -43,22 +43,19 @@
           <w:b/>
           <w:bCs/>
         </w:rPr>
-        <w:t xml:space="preserve">Status:</w:t>
-      </w:r>
-      <w:r>
-        <w:t xml:space="preserve"> </w:t>
-      </w:r>
-      <w:r>
-        <w:t xml:space="preserve">Internal decision document. It requests normal Microsoft product and standards review, not a favorable Unicode outcome.</w:t>
-      </w:r>
-    </w:p>
-    <w:bookmarkStart w:id="9" w:name="decision-requested"/>
+        <w:t>Status:</w:t>
+      </w:r>
+      <w:r>
+        <w:t xml:space="preserve"> Internal decision document. It requests normal Microsoft product and standards review, not a favorable Unicode outcome.</w:t>
+      </w:r>
+    </w:p>
     <w:p>
       <w:pPr>
         <w:pStyle w:val="Heading2"/>
       </w:pPr>
-      <w:r>
-        <w:t xml:space="preserve">Decision requested</w:t>
+      <w:bookmarkStart w:id="0" w:name="decision-requested"/>
+      <w:r>
+        <w:t>Decision requested</w:t>
       </w:r>
     </w:p>
     <w:p>
@@ -66,20 +63,17 @@
         <w:pStyle w:val="FirstParagraph"/>
       </w:pPr>
       <w:r>
-        <w:t xml:space="preserve">Please identify the Microsoft owners who can make one focused decision by</w:t>
-      </w:r>
-      <w:r>
-        <w:t xml:space="preserve"> </w:t>
+        <w:t xml:space="preserve">Please identify the Microsoft owners who can make one focused decision by </w:t>
       </w:r>
       <w:r>
         <w:rPr>
           <w:b/>
           <w:bCs/>
         </w:rPr>
-        <w:t xml:space="preserve">Friday, July 17</w:t>
-      </w:r>
-      <w:r>
-        <w:t xml:space="preserve">:</w:t>
+        <w:t>Friday, July 17</w:t>
+      </w:r>
+      <w:r>
+        <w:t>:</w:t>
       </w:r>
     </w:p>
     <w:p>
@@ -87,39 +81,30 @@
         <w:pStyle w:val="BlockText"/>
       </w:pPr>
       <w:r>
-        <w:t xml:space="preserve">Should Microsoft advance</w:t>
-      </w:r>
-      <w:r>
-        <w:t xml:space="preserve"> </w:t>
+        <w:t xml:space="preserve">Should Microsoft advance </w:t>
       </w:r>
       <w:r>
         <w:rPr>
           <w:b/>
           <w:bCs/>
         </w:rPr>
-        <w:t xml:space="preserve">CT Scan</w:t>
+        <w:t>Ultrasound</w:t>
       </w:r>
       <w:r>
         <w:t xml:space="preserve"> </w:t>
       </w:r>
       <w:r>
-        <w:t xml:space="preserve">as the lead 2026 medical emoji proposal, or wait for a final Google Trends comparison and choose</w:t>
-      </w:r>
-      <w:r>
-        <w:t xml:space="preserve"> </w:t>
+        <w:t xml:space="preserve">as the conditional lead after a 48-hour evidence and design sprint, with </w:t>
       </w:r>
       <w:r>
         <w:rPr>
           <w:b/>
           <w:bCs/>
         </w:rPr>
-        <w:t xml:space="preserve">Weight Scale</w:t>
-      </w:r>
-      <w:r>
-        <w:t xml:space="preserve"> </w:t>
-      </w:r>
-      <w:r>
-        <w:t xml:space="preserve">instead?</w:t>
+        <w:t>CT Scan</w:t>
+      </w:r>
+      <w:r>
+        <w:t xml:space="preserve"> as the filing-ready fallback?</w:t>
       </w:r>
     </w:p>
     <w:p>
@@ -127,17 +112,17 @@
         <w:pStyle w:val="FirstParagraph"/>
       </w:pPr>
       <w:r>
-        <w:t xml:space="preserve">If CT Scan is selected, please also determine whether the responsible Windows/Segoe UI Emoji product owner and Microsoft Legal can approve the anticipated-implementation language in the clearance section.</w:t>
-      </w:r>
-    </w:p>
-    <w:bookmarkEnd w:id="9"/>
-    <w:bookmarkStart w:id="10" w:name="recommendation"/>
+        <w:t>Please also determine whether the responsible Windows/Segoe UI Emoji product owner and Microsoft Legal can approve the selected paradigm, the CC0 artwork route, and the anticipated-implementation language in the clearance section.</w:t>
+      </w:r>
+    </w:p>
     <w:p>
       <w:pPr>
         <w:pStyle w:val="Heading2"/>
       </w:pPr>
-      <w:r>
-        <w:t xml:space="preserve">Recommendation</w:t>
+      <w:bookmarkStart w:id="1" w:name="recommendation"/>
+      <w:bookmarkEnd w:id="0"/>
+      <w:r>
+        <w:t>Recommendation</w:t>
       </w:r>
     </w:p>
     <w:p>
@@ -149,7 +134,14 @@
           <w:b/>
           <w:bCs/>
         </w:rPr>
-        <w:t xml:space="preserve">Advance CT Scan now. Keep Weight Scale as the challenger and Blood Bag as the packet-complete fallback. Do not route all eight eligible concepts as simultaneous submissions.</w:t>
+        <w:t xml:space="preserve">Make Ultrasound the conditional lead. Keep CT Scan as the filing-ready fallback. Do not route the full </w:t>
+      </w:r>
+      <w:r>
+        <w:rPr>
+          <w:b/>
+          <w:bCs/>
+        </w:rPr>
+        <w:t>twelve-concept portfolio as simultaneous submissions.</w:t>
       </w:r>
     </w:p>
     <w:p>
@@ -157,30 +149,26 @@
         <w:pStyle w:val="BodyText"/>
       </w:pPr>
       <w:r>
-        <w:t xml:space="preserve">CT Scan has the strongest combined packet available today: all five Unicode frequency-evidence categories, the strongest recent Google Books usage among the nine re-eligible concepts, a recognizable gantry-and-table form at 18x18, and appointment, procedure, and results meanings that are not carried by the existing X-Ray emoji.</w:t>
-      </w:r>
-    </w:p>
-    <w:p>
-      <w:pPr>
-        <w:pStyle w:val="BodyText"/>
-      </w:pPr>
-      <w:r>
-        <w:t xml:space="preserve">Weight Scale may have the broadest everyday usage. Its recovered Search and Video counts are the largest in the slate and it applies to health, fitness, luggage, shipping, and veterinary care. It still needs clean Web and Image Google Trends captures against Unicode’s</w:t>
-      </w:r>
-      <w:r>
-        <w:t xml:space="preserve"> </w:t>
+        <w:t xml:space="preserve">Ultrasound is the highest-upside concept found in the expanded review. No matching proposal appears in Unicode’s public status sheet, its recent Google Books signal is approximately </w:t>
+      </w:r>
+      <w:r>
+        <w:rPr>
+          <w:b/>
+          <w:bCs/>
+        </w:rPr>
+        <w:t>1.70 times</w:t>
+      </w:r>
+      <w:r>
+        <w:t xml:space="preserve"> Unicode’s </w:t>
       </w:r>
       <w:r>
         <w:rPr>
           <w:rStyle w:val="VerbatimChar"/>
         </w:rPr>
-        <w:t xml:space="preserve">elephant</w:t>
-      </w:r>
-      <w:r>
-        <w:t xml:space="preserve"> </w:t>
-      </w:r>
-      <w:r>
-        <w:t xml:space="preserve">reference term before it can be filed.</w:t>
+        <w:t>elephant</w:t>
+      </w:r>
+      <w:r>
+        <w:t xml:space="preserve"> comparator, and the monitor-plus-probe form supports pregnancy, cardiac, abdominal, bedside, procedure-guidance, education, and veterinary contexts without showing a patient or diagnosis.</w:t>
       </w:r>
     </w:p>
     <w:p>
@@ -188,7 +176,15 @@
         <w:pStyle w:val="BodyText"/>
       </w:pPr>
       <w:r>
-        <w:t xml:space="preserve">The three organ concepts declined on November 4, 2022 - Kidney, Stomach, and Liver - are not eligible for the intake closing July 31, 2026 because their decline dates are less than four years before the deadline. Their completed drafts should remain future assets, not consume the July Microsoft review window.</w:t>
+        <w:t>Ultrasound is not file-ready today. A Google CAPTCHA/rate limit prevented fresh Search, Video, Web Trends, and Image Trends captures. The 48-hour sprint has a simple pass/fail output: add those four required screenshots and confirm small-size recognition. If either step fails or misses the internal cutoff, file CT Scan. Its packet already contains all five evidence categories and a recognizable gantry-and-table paradigm.</w:t>
+      </w:r>
+    </w:p>
+    <w:p>
+      <w:pPr>
+        <w:pStyle w:val="BodyText"/>
+      </w:pPr>
+      <w:r>
+        <w:t>The three organ concepts declined on November 4, 2022 - Kidney, Stomach, and Liver - are not eligible for the intake closing July 31, 2026 because their decline dates are less than four years before the deadline. Their completed drafts should remain future assets, not consume the July Microsoft review window.</w:t>
       </w:r>
     </w:p>
     <w:p>
@@ -196,137 +192,168 @@
         <w:br w:type="page"/>
       </w:r>
     </w:p>
-    <w:bookmarkEnd w:id="10"/>
-    <w:bookmarkStart w:id="11" w:name="the-three-decisions-that-matter"/>
     <w:p>
       <w:pPr>
         <w:pStyle w:val="Heading2"/>
       </w:pPr>
-      <w:r>
-        <w:t xml:space="preserve">The three decisions that matter</w:t>
+      <w:bookmarkStart w:id="2" w:name="the-four-concepts-microsoft-should-see"/>
+      <w:bookmarkEnd w:id="1"/>
+      <w:r>
+        <w:lastRenderedPageBreak/>
+        <w:t>The four concepts Microsoft should see</w:t>
       </w:r>
     </w:p>
     <w:tbl>
       <w:tblPr>
         <w:tblStyle w:val="Table"/>
-        <w:tblW w:type="pct" w:w="5000"/>
+        <w:tblW w:w="5000" w:type="pct"/>
         <w:tblLayout w:type="fixed"/>
-        <w:tblLook w:firstRow="1" w:lastRow="0" w:firstColumn="0" w:lastColumn="0" w:noHBand="0" w:noVBand="0" w:val="0020"/>
+        <w:tblLook w:val="0020" w:firstRow="1" w:lastRow="0" w:firstColumn="0" w:lastColumn="0" w:noHBand="0" w:noVBand="0"/>
       </w:tblPr>
       <w:tblGrid>
-        <w:gridCol w:w="1584"/>
-        <w:gridCol w:w="1584"/>
-        <w:gridCol w:w="1584"/>
-        <w:gridCol w:w="1584"/>
-        <w:gridCol w:w="1584"/>
+        <w:gridCol w:w="1916"/>
+        <w:gridCol w:w="1915"/>
+        <w:gridCol w:w="1915"/>
+        <w:gridCol w:w="1915"/>
+        <w:gridCol w:w="1915"/>
       </w:tblGrid>
       <w:tr>
         <w:trPr>
-          <w:tblHeader w:val="on"/>
+          <w:cnfStyle w:val="100000000000" w:firstRow="1" w:lastRow="0" w:firstColumn="0" w:lastColumn="0" w:oddVBand="0" w:evenVBand="0" w:oddHBand="0" w:evenHBand="0" w:firstRowFirstColumn="0" w:firstRowLastColumn="0" w:lastRowFirstColumn="0" w:lastRowLastColumn="0"/>
+          <w:tblHeader/>
         </w:trPr>
         <w:tc>
-          <w:tcPr/>
+          <w:tcPr>
+            <w:tcW w:w="1584" w:type="dxa"/>
+          </w:tcPr>
           <w:p>
             <w:pPr>
               <w:pStyle w:val="Compact"/>
             </w:pPr>
             <w:r>
-              <w:t xml:space="preserve">Concept</w:t>
+              <w:t>Concept</w:t>
             </w:r>
           </w:p>
         </w:tc>
         <w:tc>
-          <w:tcPr/>
+          <w:tcPr>
+            <w:tcW w:w="1584" w:type="dxa"/>
+          </w:tcPr>
           <w:p>
             <w:pPr>
               <w:pStyle w:val="Compact"/>
             </w:pPr>
             <w:r>
-              <w:t xml:space="preserve">Packet today</w:t>
+              <w:t>Packet today</w:t>
             </w:r>
           </w:p>
         </w:tc>
         <w:tc>
-          <w:tcPr/>
+          <w:tcPr>
+            <w:tcW w:w="1584" w:type="dxa"/>
+          </w:tcPr>
           <w:p>
             <w:pPr>
               <w:pStyle w:val="Compact"/>
             </w:pPr>
             <w:r>
-              <w:t xml:space="preserve">Strength</w:t>
+              <w:t>Strength</w:t>
             </w:r>
           </w:p>
         </w:tc>
         <w:tc>
-          <w:tcPr/>
+          <w:tcPr>
+            <w:tcW w:w="1584" w:type="dxa"/>
+          </w:tcPr>
           <w:p>
             <w:pPr>
               <w:pStyle w:val="Compact"/>
             </w:pPr>
             <w:r>
-              <w:t xml:space="preserve">Main concern</w:t>
+              <w:t>Main concern</w:t>
             </w:r>
           </w:p>
         </w:tc>
         <w:tc>
-          <w:tcPr/>
+          <w:tcPr>
+            <w:tcW w:w="1584" w:type="dxa"/>
+          </w:tcPr>
           <w:p>
             <w:pPr>
               <w:pStyle w:val="Compact"/>
             </w:pPr>
             <w:r>
-              <w:t xml:space="preserve">Call</w:t>
+              <w:t>Call</w:t>
             </w:r>
           </w:p>
         </w:tc>
       </w:tr>
       <w:tr>
         <w:tc>
-          <w:tcPr/>
+          <w:tcPr>
+            <w:tcW w:w="1584" w:type="dxa"/>
+          </w:tcPr>
           <w:p>
             <w:pPr>
               <w:pStyle w:val="Compact"/>
             </w:pPr>
             <w:r>
-              <w:t xml:space="preserve">CT Scan</w:t>
+              <w:t>Ultrasound</w:t>
             </w:r>
           </w:p>
         </w:tc>
         <w:tc>
-          <w:tcPr/>
+          <w:tcPr>
+            <w:tcW w:w="1584" w:type="dxa"/>
+          </w:tcPr>
           <w:p>
             <w:pPr>
               <w:pStyle w:val="Compact"/>
             </w:pPr>
             <w:r>
-              <w:t xml:space="preserve">Complete</w:t>
+              <w:t>Missing four Google captures</w:t>
             </w:r>
           </w:p>
         </w:tc>
         <w:tc>
-          <w:tcPr/>
+          <w:tcPr>
+            <w:tcW w:w="1584" w:type="dxa"/>
+          </w:tcPr>
           <w:p>
             <w:pPr>
               <w:pStyle w:val="Compact"/>
             </w:pPr>
             <w:r>
-              <w:t xml:space="preserve">Best combined corpus signal; recognizable scanner; procedure and appointment uses</w:t>
+              <w:t xml:space="preserve">Novel public-sheet concept; Ngram approximately 1.70x </w:t>
+            </w:r>
+            <w:r>
+              <w:rPr>
+                <w:rStyle w:val="VerbatimChar"/>
+              </w:rPr>
+              <w:t>elephant</w:t>
+            </w:r>
+            <w:r>
+              <w:t>; broad scan uses</w:t>
             </w:r>
           </w:p>
         </w:tc>
         <w:tc>
-          <w:tcPr/>
+          <w:tcPr>
+            <w:tcW w:w="1584" w:type="dxa"/>
+          </w:tcPr>
           <w:p>
             <w:pPr>
               <w:pStyle w:val="Compact"/>
             </w:pPr>
             <w:r>
-              <w:t xml:space="preserve">Must distinguish from X-Ray</w:t>
+              <w:t>Evidence incomplete; probe must remain legible</w:t>
             </w:r>
           </w:p>
         </w:tc>
         <w:tc>
-          <w:tcPr/>
+          <w:tcPr>
+            <w:tcW w:w="1584" w:type="dxa"/>
+          </w:tcPr>
           <w:p>
             <w:pPr>
               <w:pStyle w:val="Compact"/>
@@ -336,58 +363,68 @@
                 <w:b/>
                 <w:bCs/>
               </w:rPr>
-              <w:t xml:space="preserve">Advance now</w:t>
+              <w:t>Conditional lead</w:t>
             </w:r>
           </w:p>
         </w:tc>
       </w:tr>
       <w:tr>
         <w:tc>
-          <w:tcPr/>
+          <w:tcPr>
+            <w:tcW w:w="1584" w:type="dxa"/>
+          </w:tcPr>
           <w:p>
             <w:pPr>
               <w:pStyle w:val="Compact"/>
             </w:pPr>
             <w:r>
-              <w:t xml:space="preserve">Weight Scale</w:t>
+              <w:t>CT Scan</w:t>
             </w:r>
           </w:p>
         </w:tc>
         <w:tc>
-          <w:tcPr/>
+          <w:tcPr>
+            <w:tcW w:w="1584" w:type="dxa"/>
+          </w:tcPr>
           <w:p>
             <w:pPr>
               <w:pStyle w:val="Compact"/>
             </w:pPr>
             <w:r>
-              <w:t xml:space="preserve">Missing two Trends captures</w:t>
+              <w:t>Complete</w:t>
             </w:r>
           </w:p>
         </w:tc>
         <w:tc>
-          <w:tcPr/>
+          <w:tcPr>
+            <w:tcW w:w="1584" w:type="dxa"/>
+          </w:tcPr>
           <w:p>
             <w:pPr>
               <w:pStyle w:val="Compact"/>
             </w:pPr>
             <w:r>
-              <w:t xml:space="preserve">Broad health and nonmedical use; largest recovered Search and Video counts</w:t>
+              <w:t>Strong complete corpus packet; recognizable scanner; procedure and appointment uses</w:t>
             </w:r>
           </w:p>
         </w:tc>
         <w:tc>
-          <w:tcPr/>
+          <w:tcPr>
+            <w:tcW w:w="1584" w:type="dxa"/>
+          </w:tcPr>
           <w:p>
             <w:pPr>
               <w:pStyle w:val="Compact"/>
             </w:pPr>
             <w:r>
-              <w:t xml:space="preserve">Balance Scale neighbor; evidence incomplete</w:t>
+              <w:t>Must distinguish from X-Ray; resubmission</w:t>
             </w:r>
           </w:p>
         </w:tc>
         <w:tc>
-          <w:tcPr/>
+          <w:tcPr>
+            <w:tcW w:w="1584" w:type="dxa"/>
+          </w:tcPr>
           <w:p>
             <w:pPr>
               <w:pStyle w:val="Compact"/>
@@ -397,64 +434,147 @@
                 <w:b/>
                 <w:bCs/>
               </w:rPr>
-              <w:t xml:space="preserve">Finish evidence, then challenge</w:t>
+              <w:t>Filing-ready fallback</w:t>
             </w:r>
           </w:p>
         </w:tc>
       </w:tr>
       <w:tr>
         <w:tc>
-          <w:tcPr/>
+          <w:tcPr>
+            <w:tcW w:w="1584" w:type="dxa"/>
+          </w:tcPr>
           <w:p>
             <w:pPr>
               <w:pStyle w:val="Compact"/>
             </w:pPr>
             <w:r>
-              <w:t xml:space="preserve">Blood Bag</w:t>
+              <w:t>Maze</w:t>
             </w:r>
           </w:p>
         </w:tc>
         <w:tc>
-          <w:tcPr/>
+          <w:tcPr>
+            <w:tcW w:w="1584" w:type="dxa"/>
+          </w:tcPr>
           <w:p>
             <w:pPr>
               <w:pStyle w:val="Compact"/>
             </w:pPr>
             <w:r>
-              <w:t xml:space="preserve">Complete</w:t>
+              <w:t>Missing four Google captures</w:t>
             </w:r>
           </w:p>
         </w:tc>
         <w:tc>
-          <w:tcPr/>
+          <w:tcPr>
+            <w:tcW w:w="1584" w:type="dxa"/>
+          </w:tcPr>
           <w:p>
             <w:pPr>
               <w:pStyle w:val="Compact"/>
             </w:pPr>
             <w:r>
-              <w:t xml:space="preserve">Donation, transfusion, supply, and blood-bank meanings</w:t>
+              <w:t>Broad puzzle, path, choice, complexity, and navigation meanings</w:t>
             </w:r>
           </w:p>
         </w:tc>
         <w:tc>
-          <w:tcPr/>
+          <w:tcPr>
+            <w:tcW w:w="1584" w:type="dxa"/>
+          </w:tcPr>
           <w:p>
             <w:pPr>
               <w:pStyle w:val="Compact"/>
             </w:pPr>
             <w:r>
-              <w:t xml:space="preserve">Drop of Blood is a plausible substitute</w:t>
+              <w:t xml:space="preserve">Declined twice; current Ngram below </w:t>
+            </w:r>
+            <w:r>
+              <w:rPr>
+                <w:rStyle w:val="VerbatimChar"/>
+              </w:rPr>
+              <w:t>elephant</w:t>
             </w:r>
           </w:p>
         </w:tc>
         <w:tc>
-          <w:tcPr/>
+          <w:tcPr>
+            <w:tcW w:w="1584" w:type="dxa"/>
+          </w:tcPr>
           <w:p>
             <w:pPr>
               <w:pStyle w:val="Compact"/>
             </w:pPr>
             <w:r>
-              <w:t xml:space="preserve">Fallback</w:t>
+              <w:t>Evidence reserve</w:t>
+            </w:r>
+          </w:p>
+        </w:tc>
+      </w:tr>
+      <w:tr>
+        <w:tc>
+          <w:tcPr>
+            <w:tcW w:w="1584" w:type="dxa"/>
+          </w:tcPr>
+          <w:p>
+            <w:pPr>
+              <w:pStyle w:val="Compact"/>
+            </w:pPr>
+            <w:r>
+              <w:t>First Aid Kit</w:t>
+            </w:r>
+          </w:p>
+        </w:tc>
+        <w:tc>
+          <w:tcPr>
+            <w:tcW w:w="1584" w:type="dxa"/>
+          </w:tcPr>
+          <w:p>
+            <w:pPr>
+              <w:pStyle w:val="Compact"/>
+            </w:pPr>
+            <w:r>
+              <w:t>Missing four Google captures</w:t>
+            </w:r>
+          </w:p>
+        </w:tc>
+        <w:tc>
+          <w:tcPr>
+            <w:tcW w:w="1584" w:type="dxa"/>
+          </w:tcPr>
+          <w:p>
+            <w:pPr>
+              <w:pStyle w:val="Compact"/>
+            </w:pPr>
+            <w:r>
+              <w:t>Novel public-sheet concept; iconic preparedness object</w:t>
+            </w:r>
+          </w:p>
+        </w:tc>
+        <w:tc>
+          <w:tcPr>
+            <w:tcW w:w="1584" w:type="dxa"/>
+          </w:tcPr>
+          <w:p>
+            <w:pPr>
+              <w:pStyle w:val="Compact"/>
+            </w:pPr>
+            <w:r>
+              <w:t>Low books signal; existing substitutes</w:t>
+            </w:r>
+          </w:p>
+        </w:tc>
+        <w:tc>
+          <w:tcPr>
+            <w:tcW w:w="1584" w:type="dxa"/>
+          </w:tcPr>
+          <w:p>
+            <w:pPr>
+              <w:pStyle w:val="Compact"/>
+            </w:pPr>
+            <w:r>
+              <w:t>Hold</w:t>
             </w:r>
           </w:p>
         </w:tc>
@@ -469,23 +589,20 @@
           <w:b/>
           <w:bCs/>
         </w:rPr>
-        <w:t xml:space="preserve">Hold the other six.</w:t>
-      </w:r>
-      <w:r>
-        <w:t xml:space="preserve"> </w:t>
-      </w:r>
-      <w:r>
-        <w:t xml:space="preserve">White Blood Cell needs a recognition test and compliant Trends; Inhaler needs global evidence that answers the 2018 recognition concern; Pill Box overlaps Pill and Pill Pack; IV Bag overlaps Blood Bag, Syringe, and Droplet; Leg Cast adds skin-tone complexity; and Pill Pack has the weakest independent case.</w:t>
-      </w:r>
-    </w:p>
-    <w:bookmarkEnd w:id="11"/>
-    <w:bookmarkStart w:id="12" w:name="internal-route-and-deliverables"/>
+        <w:t>Hold the other eight.</w:t>
+      </w:r>
+      <w:r>
+        <w:t xml:space="preserve"> Weight Scale and Blood Bag are reserves. The other six carry greater evidence, recognition, overlap, or implementation risk.</w:t>
+      </w:r>
+    </w:p>
     <w:p>
       <w:pPr>
         <w:pStyle w:val="Heading2"/>
       </w:pPr>
-      <w:r>
-        <w:t xml:space="preserve">Internal route and deliverables</w:t>
+      <w:bookmarkStart w:id="3" w:name="internal-route-and-deliverables"/>
+      <w:bookmarkEnd w:id="2"/>
+      <w:r>
+        <w:t>Internal route and deliverables</w:t>
       </w:r>
     </w:p>
     <w:p>
@@ -493,7 +610,7 @@
         <w:pStyle w:val="Compact"/>
         <w:numPr>
           <w:ilvl w:val="0"/>
-          <w:numId w:val="1001"/>
+          <w:numId w:val="2"/>
         </w:numPr>
       </w:pPr>
       <w:r>
@@ -501,13 +618,10 @@
           <w:b/>
           <w:bCs/>
         </w:rPr>
-        <w:t xml:space="preserve">Unicode/standards lead - July 15:</w:t>
-      </w:r>
-      <w:r>
-        <w:t xml:space="preserve"> </w:t>
-      </w:r>
-      <w:r>
-        <w:t xml:space="preserve">confirm the proper route for one eligible individual proposal.</w:t>
+        <w:t>Unicode/standards lead - July 15:</w:t>
+      </w:r>
+      <w:r>
+        <w:t xml:space="preserve"> confirm the proper route for one individual proposal.</w:t>
       </w:r>
     </w:p>
     <w:p>
@@ -515,7 +629,7 @@
         <w:pStyle w:val="Compact"/>
         <w:numPr>
           <w:ilvl w:val="0"/>
-          <w:numId w:val="1001"/>
+          <w:numId w:val="2"/>
         </w:numPr>
       </w:pPr>
       <w:r>
@@ -523,13 +637,10 @@
           <w:b/>
           <w:bCs/>
         </w:rPr>
-        <w:t xml:space="preserve">Windows/Segoe UI Emoji product owner - July 17:</w:t>
-      </w:r>
-      <w:r>
-        <w:t xml:space="preserve"> </w:t>
-      </w:r>
-      <w:r>
-        <w:t xml:space="preserve">choose CT Scan or Weight Scale and decide whether to approve the anticipated-implementation language.</w:t>
+        <w:t>Evidence owner and Shuhan He - July 15:</w:t>
+      </w:r>
+      <w:r>
+        <w:t xml:space="preserve"> capture all four missing Ultrasound screenshots and issue a pass/fail note.</w:t>
       </w:r>
     </w:p>
     <w:p>
@@ -537,7 +648,7 @@
         <w:pStyle w:val="Compact"/>
         <w:numPr>
           <w:ilvl w:val="0"/>
-          <w:numId w:val="1001"/>
+          <w:numId w:val="2"/>
         </w:numPr>
       </w:pPr>
       <w:r>
@@ -545,13 +656,10 @@
           <w:b/>
           <w:bCs/>
         </w:rPr>
-        <w:t xml:space="preserve">Fluent Emoji/Windows design and Microsoft Legal - July 20:</w:t>
-      </w:r>
-      <w:r>
-        <w:t xml:space="preserve"> </w:t>
-      </w:r>
-      <w:r>
-        <w:t xml:space="preserve">clear the lead paradigm, CC0 or Microsoft artwork route, and final statement.</w:t>
+        <w:t>Windows/Segoe UI Emoji and Fluent Emoji - July 17:</w:t>
+      </w:r>
+      <w:r>
+        <w:t xml:space="preserve"> accept the 18x18 Ultrasound probe or select CT Scan.</w:t>
       </w:r>
     </w:p>
     <w:p>
@@ -559,7 +667,7 @@
         <w:pStyle w:val="Compact"/>
         <w:numPr>
           <w:ilvl w:val="0"/>
-          <w:numId w:val="1001"/>
+          <w:numId w:val="2"/>
         </w:numPr>
       </w:pPr>
       <w:r>
@@ -567,28 +675,10 @@
           <w:b/>
           <w:bCs/>
         </w:rPr>
-        <w:t xml:space="preserve">David Rhew and Shuhan He - July 31:</w:t>
-      </w:r>
-      <w:r>
-        <w:t xml:space="preserve"> </w:t>
-      </w:r>
-      <w:r>
-        <w:t xml:space="preserve">confirm clinical accuracy, refresh the selected evidence, rebuild the packet, and file individually.</w:t>
-      </w:r>
-    </w:p>
-    <w:p>
-      <w:r>
-        <w:br w:type="page"/>
-      </w:r>
-    </w:p>
-    <w:bookmarkEnd w:id="12"/>
-    <w:bookmarkStart w:id="13" w:name="guardrails"/>
-    <w:p>
-      <w:pPr>
-        <w:pStyle w:val="Heading2"/>
-      </w:pPr>
-      <w:r>
-        <w:t xml:space="preserve">Guardrails</w:t>
+        <w:t>Microsoft Legal - July 20:</w:t>
+      </w:r>
+      <w:r>
+        <w:t xml:space="preserve"> clear the CC0 artwork route and final anticipated-implementation statement.</w:t>
       </w:r>
     </w:p>
     <w:p>
@@ -596,227 +686,191 @@
         <w:pStyle w:val="Compact"/>
         <w:numPr>
           <w:ilvl w:val="0"/>
-          <w:numId w:val="1002"/>
+          <w:numId w:val="2"/>
         </w:numPr>
-      </w:pPr>
-      <w:r>
-        <w:t xml:space="preserve">Shuhan He remains the individual submitter; the Unicode form does not accept a company as the submitter.</w:t>
-      </w:r>
-    </w:p>
-    <w:p>
-      <w:pPr>
-        <w:pStyle w:val="Compact"/>
-        <w:numPr>
-          <w:ilvl w:val="0"/>
-          <w:numId w:val="1002"/>
-        </w:numPr>
-      </w:pPr>
-      <w:r>
-        <w:t xml:space="preserve">Ask Microsoft’s Unicode contacts about process and venue, never for a preferred technical outcome.</w:t>
-      </w:r>
-    </w:p>
-    <w:p>
-      <w:pPr>
-        <w:pStyle w:val="Compact"/>
-        <w:numPr>
-          <w:ilvl w:val="0"/>
-          <w:numId w:val="1002"/>
-        </w:numPr>
-      </w:pPr>
-      <w:r>
-        <w:t xml:space="preserve">Do not describe Microsoft as supporting implementation until the responsible product owner and legal team approve the language.</w:t>
-      </w:r>
-    </w:p>
-    <w:p>
-      <w:pPr>
-        <w:pStyle w:val="Compact"/>
-        <w:numPr>
-          <w:ilvl w:val="0"/>
-          <w:numId w:val="1002"/>
-        </w:numPr>
-      </w:pPr>
-      <w:r>
-        <w:t xml:space="preserve">File one lead proposal. A second filing should require a separate product decision and clearly independent evidence.</w:t>
-      </w:r>
-    </w:p>
-    <w:p>
-      <w:pPr>
-        <w:pStyle w:val="Compact"/>
-        <w:numPr>
-          <w:ilvl w:val="0"/>
-          <w:numId w:val="1002"/>
-        </w:numPr>
-      </w:pPr>
-      <w:r>
-        <w:t xml:space="preserve">Do not file both Pill Box and Pill Pack, or both Blood Bag and IV Bag, without resolving their overlap.</w:t>
-      </w:r>
-    </w:p>
-    <w:p>
-      <w:pPr>
-        <w:pStyle w:val="Compact"/>
-        <w:numPr>
-          <w:ilvl w:val="0"/>
-          <w:numId w:val="1002"/>
-        </w:numPr>
-      </w:pPr>
-      <w:r>
-        <w:t xml:space="preserve">Historical Google evidence is dated accurately. Refresh the selected packet where a clean manual Google session permits it.</w:t>
-      </w:r>
-    </w:p>
-    <w:bookmarkEnd w:id="13"/>
-    <w:bookmarkStart w:id="14" w:name="material-ready-for-review"/>
-    <w:p>
-      <w:pPr>
-        <w:pStyle w:val="Heading2"/>
-      </w:pPr>
-      <w:r>
-        <w:t xml:space="preserve">Material ready for review</w:t>
-      </w:r>
-    </w:p>
-    <w:p>
-      <w:pPr>
-        <w:pStyle w:val="Compact"/>
-        <w:numPr>
-          <w:ilvl w:val="0"/>
-          <w:numId w:val="1003"/>
-        </w:numPr>
-      </w:pPr>
-      <w:r>
-        <w:t xml:space="preserve">Complete CT Scan and Blood Bag packets; evidence-gated Weight Scale challenger.</w:t>
-      </w:r>
-    </w:p>
-    <w:p>
-      <w:pPr>
-        <w:pStyle w:val="Compact"/>
-        <w:numPr>
-          <w:ilvl w:val="0"/>
-          <w:numId w:val="1003"/>
-        </w:numPr>
-      </w:pPr>
-      <w:r>
-        <w:t xml:space="preserve">Comparative ranking and independent drafts for all nine clearly re-eligible concepts.</w:t>
-      </w:r>
-    </w:p>
-    <w:p>
-      <w:pPr>
-        <w:pStyle w:val="Compact"/>
-        <w:numPr>
-          <w:ilvl w:val="0"/>
-          <w:numId w:val="1003"/>
-        </w:numPr>
-      </w:pPr>
-      <w:r>
-        <w:t xml:space="preserve">Original color and black-and-white SVG/PNG artwork released under CC0 1.0.</w:t>
-      </w:r>
-    </w:p>
-    <w:p>
-      <w:pPr>
-        <w:pStyle w:val="FirstParagraph"/>
-      </w:pPr>
-      <w:r>
-        <w:t xml:space="preserve">Proposal release:</w:t>
-      </w:r>
-    </w:p>
-    <w:p>
-      <w:pPr>
-        <w:pStyle w:val="BodyText"/>
-      </w:pPr>
-      <w:r>
-        <w:t xml:space="preserve">https://github.com/ShuhanCS/medicalemoji/tree/codex/eligible-2026-slate/submissions/v1.3.0</w:t>
-      </w:r>
-    </w:p>
-    <w:bookmarkEnd w:id="14"/>
-    <w:bookmarkStart w:id="15" w:name="source-record"/>
-    <w:p>
-      <w:pPr>
-        <w:pStyle w:val="Heading2"/>
-      </w:pPr>
-      <w:r>
-        <w:t xml:space="preserve">Source record</w:t>
-      </w:r>
-    </w:p>
-    <w:p>
-      <w:pPr>
-        <w:pStyle w:val="Compact"/>
-        <w:numPr>
-          <w:ilvl w:val="0"/>
-          <w:numId w:val="1004"/>
-        </w:numPr>
-      </w:pPr>
-      <w:r>
-        <w:t xml:space="preserve">Unicode proposal guidance: https://www.unicode.org/emoji/proposals.html</w:t>
-      </w:r>
-    </w:p>
-    <w:p>
-      <w:pPr>
-        <w:pStyle w:val="Compact"/>
-        <w:numPr>
-          <w:ilvl w:val="0"/>
-          <w:numId w:val="1004"/>
-        </w:numPr>
-      </w:pPr>
-      <w:r>
-        <w:t xml:space="preserve">Unicode Emoji Submission FAQ: https://www.unicode.org/faq/emoji_submission.html</w:t>
-      </w:r>
-    </w:p>
-    <w:p>
-      <w:pPr>
-        <w:pStyle w:val="Compact"/>
-        <w:numPr>
-          <w:ilvl w:val="0"/>
-          <w:numId w:val="1004"/>
-        </w:numPr>
-      </w:pPr>
-      <w:r>
-        <w:t xml:space="preserve">Unicode proposal status: https://www.unicode.org/emoji/emoji-proposals-status.html</w:t>
-      </w:r>
-    </w:p>
-    <w:p>
-      <w:pPr>
-        <w:pStyle w:val="Compact"/>
-        <w:numPr>
-          <w:ilvl w:val="0"/>
-          <w:numId w:val="1004"/>
-        </w:numPr>
-      </w:pPr>
-      <w:r>
-        <w:t xml:space="preserve">Microsoft Fluent Emoji: https://github.com/microsoft/fluentui-emoji</w:t>
-      </w:r>
-    </w:p>
-    <w:p>
-      <w:r>
-        <w:br w:type="page"/>
-      </w:r>
-    </w:p>
-    <w:bookmarkEnd w:id="15"/>
-    <w:bookmarkStart w:id="17" w:name="draft-for-product-and-legal-clearance"/>
-    <w:p>
-      <w:pPr>
-        <w:pStyle w:val="Heading1"/>
-      </w:pPr>
-      <w:r>
-        <w:t xml:space="preserve">Draft for Product and Legal Clearance</w:t>
-      </w:r>
-    </w:p>
-    <w:bookmarkStart w:id="16" w:name="X62623f00acf2320d71bb453f7a241052393aae6"/>
-    <w:p>
-      <w:pPr>
-        <w:pStyle w:val="Heading2"/>
-      </w:pPr>
-      <w:r>
-        <w:t xml:space="preserve">Microsoft anticipated implementation support</w:t>
-      </w:r>
-    </w:p>
-    <w:p>
-      <w:pPr>
-        <w:pStyle w:val="FirstParagraph"/>
       </w:pPr>
       <w:r>
         <w:rPr>
           <w:b/>
           <w:bCs/>
         </w:rPr>
-        <w:t xml:space="preserve">Working text - do not submit until approved and signed by the responsible Microsoft product owner.</w:t>
+        <w:t>David Rhew and Shuhan He - July 31:</w:t>
+      </w:r>
+      <w:r>
+        <w:t xml:space="preserve"> rebuild, inspect, and file the selected proposal individually.</w:t>
+      </w:r>
+    </w:p>
+    <w:p>
+      <w:pPr>
+        <w:pStyle w:val="Heading2"/>
+      </w:pPr>
+      <w:bookmarkStart w:id="4" w:name="guardrails"/>
+      <w:bookmarkEnd w:id="3"/>
+      <w:r>
+        <w:lastRenderedPageBreak/>
+        <w:t>Guardrails</w:t>
+      </w:r>
+    </w:p>
+    <w:p>
+      <w:pPr>
+        <w:pStyle w:val="Compact"/>
+        <w:numPr>
+          <w:ilvl w:val="0"/>
+          <w:numId w:val="3"/>
+        </w:numPr>
+      </w:pPr>
+      <w:r>
+        <w:t>Shuhan He remains the individual submitter; the Unicode form does not accept a company as the submitter.</w:t>
+      </w:r>
+    </w:p>
+    <w:p>
+      <w:pPr>
+        <w:pStyle w:val="Compact"/>
+        <w:numPr>
+          <w:ilvl w:val="0"/>
+          <w:numId w:val="3"/>
+        </w:numPr>
+      </w:pPr>
+      <w:r>
+        <w:t>Ask Microsoft’s Unicode contacts about process and venue, never for a preferred technical outcome.</w:t>
+      </w:r>
+    </w:p>
+    <w:p>
+      <w:pPr>
+        <w:pStyle w:val="Compact"/>
+        <w:numPr>
+          <w:ilvl w:val="0"/>
+          <w:numId w:val="3"/>
+        </w:numPr>
+      </w:pPr>
+      <w:r>
+        <w:t>Do not describe Microsoft as supporting implementation until the responsible product owner and legal team approve the language.</w:t>
+      </w:r>
+    </w:p>
+    <w:p>
+      <w:pPr>
+        <w:pStyle w:val="Compact"/>
+        <w:numPr>
+          <w:ilvl w:val="0"/>
+          <w:numId w:val="3"/>
+        </w:numPr>
+      </w:pPr>
+      <w:r>
+        <w:t>File one lead proposal. A second filing should require a separate product decision and clearly independent evidence.</w:t>
+      </w:r>
+    </w:p>
+    <w:p>
+      <w:pPr>
+        <w:pStyle w:val="Compact"/>
+        <w:numPr>
+          <w:ilvl w:val="0"/>
+          <w:numId w:val="3"/>
+        </w:numPr>
+      </w:pPr>
+      <w:r>
+        <w:t>Do not file both Pill Box and Pill Pack, or both Blood Bag and IV Bag, without resolving their overlap.</w:t>
+      </w:r>
+    </w:p>
+    <w:p>
+      <w:pPr>
+        <w:pStyle w:val="Compact"/>
+        <w:numPr>
+          <w:ilvl w:val="0"/>
+          <w:numId w:val="3"/>
+        </w:numPr>
+      </w:pPr>
+      <w:r>
+        <w:t>Maze must be framed as a general puzzle and navigation object, not as a neuroscience-awareness cause.</w:t>
+      </w:r>
+    </w:p>
+    <w:p>
+      <w:pPr>
+        <w:pStyle w:val="Compact"/>
+        <w:numPr>
+          <w:ilvl w:val="0"/>
+          <w:numId w:val="3"/>
+        </w:numPr>
+      </w:pPr>
+      <w:r>
+        <w:t>First Aid Kit must retain a generic non-red safety cross and must not reproduce a protected humanitarian emblem.</w:t>
+      </w:r>
+    </w:p>
+    <w:p>
+      <w:pPr>
+        <w:pStyle w:val="Compact"/>
+        <w:numPr>
+          <w:ilvl w:val="0"/>
+          <w:numId w:val="3"/>
+        </w:numPr>
+      </w:pPr>
+      <w:r>
+        <w:t>Evidence gaps are labeled accurately. Do not submit an editorial placeholder as if it were a compliant screenshot.</w:t>
+      </w:r>
+    </w:p>
+    <w:p>
+      <w:pPr>
+        <w:pStyle w:val="Heading2"/>
+      </w:pPr>
+      <w:bookmarkStart w:id="5" w:name="material-ready-for-review"/>
+      <w:bookmarkEnd w:id="4"/>
+      <w:r>
+        <w:t>Material ready for review</w:t>
+      </w:r>
+    </w:p>
+    <w:p>
+      <w:pPr>
+        <w:pStyle w:val="Compact"/>
+        <w:numPr>
+          <w:ilvl w:val="0"/>
+          <w:numId w:val="4"/>
+        </w:numPr>
+      </w:pPr>
+      <w:r>
+        <w:t>A complete CT Scan fallback packet.</w:t>
+      </w:r>
+    </w:p>
+    <w:p>
+      <w:pPr>
+        <w:pStyle w:val="Compact"/>
+        <w:numPr>
+          <w:ilvl w:val="0"/>
+          <w:numId w:val="4"/>
+        </w:numPr>
+      </w:pPr>
+      <w:r>
+        <w:t>Full evidence-gated drafts for Ultrasound, Maze, and First Aid Kit.</w:t>
+      </w:r>
+    </w:p>
+    <w:p>
+      <w:pPr>
+        <w:pStyle w:val="Compact"/>
+        <w:numPr>
+          <w:ilvl w:val="0"/>
+          <w:numId w:val="4"/>
+        </w:numPr>
+      </w:pPr>
+      <w:r>
+        <w:t>Comparative ranking and independent drafts across the twelve-concept expanded portfolio.</w:t>
+      </w:r>
+    </w:p>
+    <w:p>
+      <w:pPr>
+        <w:pStyle w:val="Compact"/>
+        <w:numPr>
+          <w:ilvl w:val="0"/>
+          <w:numId w:val="4"/>
+        </w:numPr>
+      </w:pPr>
+      <w:r>
+        <w:t>Original color and black-and-white SVG/PNG artwork released under CC0 1.0.</w:t>
+      </w:r>
+    </w:p>
+    <w:p>
+      <w:pPr>
+        <w:pStyle w:val="FirstParagraph"/>
+      </w:pPr>
+      <w:r>
+        <w:t>Proposal release:</w:t>
       </w:r>
     </w:p>
     <w:p>
@@ -824,23 +878,114 @@
         <w:pStyle w:val="BodyText"/>
       </w:pPr>
       <w:r>
-        <w:t xml:space="preserve">Microsoft supports the Unicode Consortium’s consideration of the</w:t>
-      </w:r>
-      <w:r>
-        <w:t xml:space="preserve"> </w:t>
-      </w:r>
+        <w:t>https://github.com/ShuhanCS/medicalemoji/tree/codex/eligible-2026-slate/submissions/v1.4.0</w:t>
+      </w:r>
+    </w:p>
+    <w:p>
+      <w:pPr>
+        <w:pStyle w:val="BodyText"/>
+      </w:pPr>
+      <w:r>
+        <w:t>Complete CT Scan fallback:</w:t>
+      </w:r>
+    </w:p>
+    <w:p>
+      <w:pPr>
+        <w:pStyle w:val="BodyText"/>
+      </w:pPr>
+      <w:r>
+        <w:t>https://github.com/ShuhanCS/medicalemoji/tree/codex/eligible-2026-slate/submissions/v1.3.0/ct-scan</w:t>
+      </w:r>
+    </w:p>
+    <w:p>
+      <w:pPr>
+        <w:pStyle w:val="Heading2"/>
+      </w:pPr>
+      <w:bookmarkStart w:id="6" w:name="source-record"/>
+      <w:bookmarkEnd w:id="5"/>
+      <w:r>
+        <w:t>Source record</w:t>
+      </w:r>
+    </w:p>
+    <w:p>
+      <w:pPr>
+        <w:pStyle w:val="Compact"/>
+        <w:numPr>
+          <w:ilvl w:val="0"/>
+          <w:numId w:val="5"/>
+        </w:numPr>
+      </w:pPr>
+      <w:r>
+        <w:t>Unicode proposal guidance: https://www.unicode.org/emoji/proposals.html</w:t>
+      </w:r>
+    </w:p>
+    <w:p>
+      <w:pPr>
+        <w:pStyle w:val="Compact"/>
+        <w:numPr>
+          <w:ilvl w:val="0"/>
+          <w:numId w:val="5"/>
+        </w:numPr>
+      </w:pPr>
+      <w:r>
+        <w:t>Unicode Emoji Submission FAQ: https://www.unicode.org/faq/emoji_submission.html</w:t>
+      </w:r>
+    </w:p>
+    <w:p>
+      <w:pPr>
+        <w:pStyle w:val="Compact"/>
+        <w:numPr>
+          <w:ilvl w:val="0"/>
+          <w:numId w:val="5"/>
+        </w:numPr>
+      </w:pPr>
+      <w:r>
+        <w:t>Unicode proposal status: https://www.unicode.org/emoji/emoji-proposals-status.html</w:t>
+      </w:r>
+    </w:p>
+    <w:p>
+      <w:pPr>
+        <w:pStyle w:val="Compact"/>
+        <w:numPr>
+          <w:ilvl w:val="0"/>
+          <w:numId w:val="5"/>
+        </w:numPr>
+      </w:pPr>
+      <w:r>
+        <w:t>Microsoft Fluent Emoji: https://github.com/microsoft/fluentui-emoji</w:t>
+      </w:r>
+    </w:p>
+    <w:p>
+      <w:pPr>
+        <w:pStyle w:val="Heading1"/>
+        <w:pageBreakBefore/>
+      </w:pPr>
+      <w:bookmarkStart w:id="7" w:name="draft-for-product-and-legal-clearance"/>
+      <w:bookmarkEnd w:id="6"/>
+      <w:r>
+        <w:lastRenderedPageBreak/>
+        <w:t>Draft for Product and Legal Clearance</w:t>
+      </w:r>
+    </w:p>
+    <w:p>
+      <w:pPr>
+        <w:pStyle w:val="Heading2"/>
+      </w:pPr>
+      <w:bookmarkStart w:id="8" w:name="X62623f00acf2320d71bb453f7a241052393aae6"/>
+      <w:r>
+        <w:t>Microsoft anticipated implementation support</w:t>
+      </w:r>
+    </w:p>
+    <w:p>
+      <w:pPr>
+        <w:pStyle w:val="FirstParagraph"/>
+      </w:pPr>
       <w:r>
         <w:rPr>
           <w:b/>
           <w:bCs/>
         </w:rPr>
-        <w:t xml:space="preserve">CT Scan</w:t>
-      </w:r>
-      <w:r>
-        <w:t xml:space="preserve"> </w:t>
-      </w:r>
-      <w:r>
-        <w:t xml:space="preserve">emoji proposal submitted by Shuhan He. If the character is encoded and recommended for general interchange as emoji, Microsoft anticipates implementing it in Segoe UI Emoji and relevant Microsoft emoji experiences through its standard design, product-planning, accessibility, legal, and release processes.</w:t>
+        <w:t>Working text - do not submit until approved and signed by the responsible Microsoft product owner.</w:t>
       </w:r>
     </w:p>
     <w:p>
@@ -848,79 +993,66 @@
         <w:pStyle w:val="BodyText"/>
       </w:pPr>
       <w:r>
-        <w:t xml:space="preserve">Microsoft would retain control of its vendor-specific artwork and implementation schedule. This statement supplies anticipated vendor support; it does not request preferential treatment, pre-judge Unicode’s technical review, or bypass Microsoft’s normal approvals.</w:t>
-      </w:r>
-    </w:p>
-    <w:p>
-      <w:pPr>
-        <w:pStyle w:val="BodyText"/>
-      </w:pPr>
-      <w:r>
-        <w:t xml:space="preserve">If Microsoft selects Weight Scale instead, replace</w:t>
-      </w:r>
-      <w:r>
-        <w:t xml:space="preserve"> </w:t>
-      </w:r>
-      <w:r>
-        <w:rPr>
-          <w:rStyle w:val="VerbatimChar"/>
-        </w:rPr>
-        <w:t xml:space="preserve">CT Scan</w:t>
-      </w:r>
-      <w:r>
-        <w:t xml:space="preserve"> </w:t>
-      </w:r>
-      <w:r>
-        <w:t xml:space="preserve">with</w:t>
-      </w:r>
-      <w:r>
-        <w:t xml:space="preserve"> </w:t>
-      </w:r>
-      <w:r>
-        <w:rPr>
-          <w:rStyle w:val="VerbatimChar"/>
-        </w:rPr>
-        <w:t xml:space="preserve">Weight Scale</w:t>
-      </w:r>
-      <w:r>
-        <w:t xml:space="preserve"> </w:t>
-      </w:r>
-      <w:r>
-        <w:t xml:space="preserve">only after the packet’s missing Trends evidence is completed and the design owner approves the paradigm.</w:t>
-      </w:r>
-    </w:p>
-    <w:p>
-      <w:pPr>
-        <w:pStyle w:val="BodyText"/>
-      </w:pPr>
+        <w:t xml:space="preserve">Microsoft supports the Unicode Consortium’s consideration of the </w:t>
+      </w:r>
       <w:r>
         <w:rPr>
           <w:b/>
           <w:bCs/>
         </w:rPr>
-        <w:t xml:space="preserve">Approved by:</w:t>
-      </w:r>
-      <w:r>
-        <w:t xml:space="preserve"> </w:t>
-      </w:r>
-      <w:r>
-        <w:t xml:space="preserve">____________________________________</w:t>
-      </w:r>
-      <w:r>
-        <w:br/>
-      </w:r>
+        <w:t>[Ultrasound / CT Scan - select one]</w:t>
+      </w:r>
+      <w:r>
+        <w:t xml:space="preserve"> emoji proposal submitted by Shuhan He. If the character is encoded and recommended for general interchange as emoji, Microsoft anticipates implementing it in Segoe UI Emoji and relevant Microsoft emoji experiences through its standard design, product-planning, accessibility, legal, and release processes.</w:t>
+      </w:r>
+    </w:p>
+    <w:p>
+      <w:pPr>
+        <w:pStyle w:val="BodyText"/>
+      </w:pPr>
+      <w:r>
+        <w:t>Microsoft would retain control of its vendor-specific artwork and implementation schedule. This statement supplies anticipated vendor support; it does not request preferential treatment, pre-judge Unicode’s technical review, or bypass Microsoft’s normal approvals.</w:t>
+      </w:r>
+    </w:p>
+    <w:p>
+      <w:pPr>
+        <w:pStyle w:val="BodyText"/>
+      </w:pPr>
+      <w:r>
+        <w:t xml:space="preserve">Select </w:t>
+      </w:r>
+      <w:r>
+        <w:rPr>
+          <w:rStyle w:val="VerbatimChar"/>
+        </w:rPr>
+        <w:t>Ultrasound</w:t>
+      </w:r>
+      <w:r>
+        <w:t xml:space="preserve"> only after all four missing Google screenshots are inserted and the design owner approves the monitor-and-probe paradigm. Otherwise select </w:t>
+      </w:r>
+      <w:r>
+        <w:rPr>
+          <w:rStyle w:val="VerbatimChar"/>
+        </w:rPr>
+        <w:t>CT Scan</w:t>
+      </w:r>
+      <w:r>
+        <w:t xml:space="preserve"> and refresh its historical evidence where a clean manual session permits it.</w:t>
+      </w:r>
+    </w:p>
+    <w:p>
+      <w:pPr>
+        <w:pStyle w:val="BodyText"/>
+      </w:pPr>
       <w:r>
         <w:rPr>
           <w:b/>
           <w:bCs/>
         </w:rPr>
-        <w:t xml:space="preserve">Title / product responsibility:</w:t>
-      </w:r>
-      <w:r>
-        <w:t xml:space="preserve"> </w:t>
-      </w:r>
-      <w:r>
-        <w:t xml:space="preserve">_________________________</w:t>
+        <w:t>Approved by:</w:t>
+      </w:r>
+      <w:r>
+        <w:t xml:space="preserve"> ____________________________________</w:t>
       </w:r>
       <w:r>
         <w:br/>
@@ -930,13 +1062,10 @@
           <w:b/>
           <w:bCs/>
         </w:rPr>
-        <w:t xml:space="preserve">Date:</w:t>
-      </w:r>
-      <w:r>
-        <w:t xml:space="preserve"> </w:t>
-      </w:r>
-      <w:r>
-        <w:t xml:space="preserve">__________________</w:t>
+        <w:t>Title / product responsibility:</w:t>
+      </w:r>
+      <w:r>
+        <w:t xml:space="preserve"> _________________________</w:t>
       </w:r>
       <w:r>
         <w:br/>
@@ -946,54 +1075,45 @@
           <w:b/>
           <w:bCs/>
         </w:rPr>
-        <w:t xml:space="preserve">Microsoft contact:</w:t>
-      </w:r>
-      <w:r>
-        <w:t xml:space="preserve"> </w:t>
-      </w:r>
-      <w:r>
-        <w:t xml:space="preserve">__________________________________</w:t>
-      </w:r>
-    </w:p>
-    <w:bookmarkEnd w:id="16"/>
-    <w:bookmarkEnd w:id="17"/>
+        <w:t>Date:</w:t>
+      </w:r>
+      <w:r>
+        <w:t xml:space="preserve"> __________________</w:t>
+      </w:r>
+      <w:r>
+        <w:br/>
+      </w:r>
+      <w:r>
+        <w:rPr>
+          <w:b/>
+          <w:bCs/>
+        </w:rPr>
+        <w:t>Microsoft contact:</w:t>
+      </w:r>
+      <w:r>
+        <w:t xml:space="preserve"> __________________________________</w:t>
+      </w:r>
+      <w:bookmarkEnd w:id="7"/>
+      <w:bookmarkEnd w:id="8"/>
+    </w:p>
     <w:sectPr>
       <w:footnotePr>
         <w:numRestart w:val="eachSect"/>
       </w:footnotePr>
+      <w:pgSz w:w="12240" w:h="15840"/>
+      <w:pgMar w:top="1440" w:right="1440" w:bottom="1440" w:left="1440" w:header="720" w:footer="720" w:gutter="0"/>
+      <w:cols w:space="720"/>
     </w:sectPr>
   </w:body>
 </w:document>
 </file>
 
-<file path=word/comments.xml><?xml version="1.0" encoding="utf-8"?>
-<w:comments xmlns:w="http://schemas.openxmlformats.org/wordprocessingml/2006/main" xmlns:m="http://schemas.openxmlformats.org/officeDocument/2006/math" xmlns:r="http://schemas.openxmlformats.org/officeDocument/2006/relationships" xmlns:o="urn:schemas-microsoft-com:office:office" xmlns:v="urn:schemas-microsoft-com:vml" xmlns:w10="urn:schemas-microsoft-com:office:word" xmlns:a="http://schemas.openxmlformats.org/drawingml/2006/main" xmlns:pic="http://schemas.openxmlformats.org/drawingml/2006/picture" xmlns:wp="http://schemas.openxmlformats.org/drawingml/2006/wordprocessingDrawing"/>
-</file>
-
-<file path=word/footnotes.xml><?xml version="1.0" encoding="utf-8"?>
-<w:footnotes xmlns:w="http://schemas.openxmlformats.org/wordprocessingml/2006/main" xmlns:m="http://schemas.openxmlformats.org/officeDocument/2006/math" xmlns:r="http://schemas.openxmlformats.org/officeDocument/2006/relationships" xmlns:o="urn:schemas-microsoft-com:office:office" xmlns:v="urn:schemas-microsoft-com:vml" xmlns:w10="urn:schemas-microsoft-com:office:word" xmlns:a="http://schemas.openxmlformats.org/drawingml/2006/main" xmlns:pic="http://schemas.openxmlformats.org/drawingml/2006/picture" xmlns:wp="http://schemas.openxmlformats.org/drawingml/2006/wordprocessingDrawing">
-  <w:footnote w:type="continuationSeparator" w:id="0">
-    <w:p>
-      <w:r>
-        <w:continuationSeparator/>
-      </w:r>
-    </w:p>
-  </w:footnote>
-  <w:footnote w:type="separator" w:id="-1">
-    <w:p>
-      <w:r>
-        <w:separator/>
-      </w:r>
-    </w:p>
-  </w:footnote>
-</w:footnotes>
-</file>
-
 <file path=word/numbering.xml><?xml version="1.0" encoding="utf-8"?>
-<w:numbering xmlns:w="http://schemas.openxmlformats.org/wordprocessingml/2006/main">
-  <w:abstractNum w:abstractNumId="990">
+<w:numbering xmlns:wpc="http://schemas.microsoft.com/office/word/2010/wordprocessingCanvas" xmlns:cx="http://schemas.microsoft.com/office/drawing/2014/chartex" xmlns:cx1="http://schemas.microsoft.com/office/drawing/2015/9/8/chartex" xmlns:cx2="http://schemas.microsoft.com/office/drawing/2015/10/21/chartex" xmlns:cx3="http://schemas.microsoft.com/office/drawing/2016/5/9/chartex" xmlns:cx4="http://schemas.microsoft.com/office/drawing/2016/5/10/chartex" xmlns:cx5="http://schemas.microsoft.com/office/drawing/2016/5/11/chartex" xmlns:cx6="http://schemas.microsoft.com/office/drawing/2016/5/12/chartex" xmlns:cx7="http://schemas.microsoft.com/office/drawing/2016/5/13/chartex" xmlns:cx8="http://schemas.microsoft.com/office/drawing/2016/5/14/chartex" xmlns:mc="http://schemas.openxmlformats.org/markup-compatibility/2006" xmlns:aink="http://schemas.microsoft.com/office/drawing/2016/ink" xmlns:am3d="http://schemas.microsoft.com/office/drawing/2017/model3d" xmlns:o="urn:schemas-microsoft-com:office:office" xmlns:oel="http://schemas.microsoft.com/office/2019/extlst" xmlns:r="http://schemas.openxmlformats.org/officeDocument/2006/relationships" xmlns:m="http://schemas.openxmlformats.org/officeDocument/2006/math" xmlns:v="urn:schemas-microsoft-com:vml" xmlns:wp14="http://schemas.microsoft.com/office/word/2010/wordprocessingDrawing" xmlns:wp="http://schemas.openxmlformats.org/drawingml/2006/wordprocessingDrawing" xmlns:w10="urn:schemas-microsoft-com:office:word" xmlns:w="http://schemas.openxmlformats.org/wordprocessingml/2006/main" xmlns:w14="http://schemas.microsoft.com/office/word/2010/wordml" xmlns:w15="http://schemas.microsoft.com/office/word/2012/wordml" xmlns:w16cex="http://schemas.microsoft.com/office/word/2018/wordml/cex" xmlns:w16cid="http://schemas.microsoft.com/office/word/2016/wordml/cid" xmlns:w16="http://schemas.microsoft.com/office/word/2018/wordml" xmlns:w16du="http://schemas.microsoft.com/office/word/2023/wordml/word16du" xmlns:w16sdtdh="http://schemas.microsoft.com/office/word/2020/wordml/sdtdatahash" xmlns:w16sdtfl="http://schemas.microsoft.com/office/word/2024/wordml/sdtformatlock" xmlns:w16se="http://schemas.microsoft.com/office/word/2015/wordml/symex" xmlns:wpg="http://schemas.microsoft.com/office/word/2010/wordprocessingGroup" xmlns:wpi="http://schemas.microsoft.com/office/word/2010/wordprocessingInk" xmlns:wne="http://schemas.microsoft.com/office/word/2006/wordml" xmlns:wps="http://schemas.microsoft.com/office/word/2010/wordprocessingShape" mc:Ignorable="w14 w15 w16se w16cid w16 w16cex w16sdtdh w16sdtfl w16du wp14">
+  <w:abstractNum w:abstractNumId="0" w15:restartNumberingAfterBreak="0">
     <w:nsid w:val="0000A990"/>
     <w:multiLevelType w:val="multilevel"/>
+    <w:tmpl w:val="D354FB30"/>
     <w:lvl w:ilvl="0">
       <w:numFmt w:val="bullet"/>
       <w:lvlText w:val=" "/>
@@ -1067,94 +1187,10 @@
       </w:pPr>
     </w:lvl>
   </w:abstractNum>
-  <w:abstractNum w:abstractNumId="99411">
-    <w:nsid w:val="00A99411"/>
-    <w:multiLevelType w:val="multilevel"/>
-    <w:lvl w:ilvl="0">
-      <w:start w:val="1"/>
-      <w:numFmt w:val="decimal"/>
-      <w:lvlText w:val="%1."/>
-      <w:lvlJc w:val="left"/>
-      <w:pPr>
-        <w:ind w:left="720" w:hanging="360"/>
-      </w:pPr>
-    </w:lvl>
-    <w:lvl w:ilvl="1">
-      <w:start w:val="1"/>
-      <w:numFmt w:val="decimal"/>
-      <w:lvlText w:val="%2."/>
-      <w:lvlJc w:val="left"/>
-      <w:pPr>
-        <w:ind w:left="1440" w:hanging="360"/>
-      </w:pPr>
-    </w:lvl>
-    <w:lvl w:ilvl="2">
-      <w:start w:val="1"/>
-      <w:numFmt w:val="decimal"/>
-      <w:lvlText w:val="%3."/>
-      <w:lvlJc w:val="left"/>
-      <w:pPr>
-        <w:ind w:left="2160" w:hanging="360"/>
-      </w:pPr>
-    </w:lvl>
-    <w:lvl w:ilvl="3">
-      <w:start w:val="1"/>
-      <w:numFmt w:val="decimal"/>
-      <w:lvlText w:val="%4."/>
-      <w:lvlJc w:val="left"/>
-      <w:pPr>
-        <w:ind w:left="2880" w:hanging="360"/>
-      </w:pPr>
-    </w:lvl>
-    <w:lvl w:ilvl="4">
-      <w:start w:val="1"/>
-      <w:numFmt w:val="decimal"/>
-      <w:lvlText w:val="%5."/>
-      <w:lvlJc w:val="left"/>
-      <w:pPr>
-        <w:ind w:left="3600" w:hanging="360"/>
-      </w:pPr>
-    </w:lvl>
-    <w:lvl w:ilvl="5">
-      <w:start w:val="1"/>
-      <w:numFmt w:val="decimal"/>
-      <w:lvlText w:val="%6."/>
-      <w:lvlJc w:val="left"/>
-      <w:pPr>
-        <w:ind w:left="4320" w:hanging="360"/>
-      </w:pPr>
-    </w:lvl>
-    <w:lvl w:ilvl="6">
-      <w:start w:val="1"/>
-      <w:numFmt w:val="decimal"/>
-      <w:lvlText w:val="%7."/>
-      <w:lvlJc w:val="left"/>
-      <w:pPr>
-        <w:ind w:left="5040" w:hanging="360"/>
-      </w:pPr>
-    </w:lvl>
-    <w:lvl w:ilvl="7">
-      <w:start w:val="1"/>
-      <w:numFmt w:val="decimal"/>
-      <w:lvlText w:val="%8."/>
-      <w:lvlJc w:val="left"/>
-      <w:pPr>
-        <w:ind w:left="5760" w:hanging="360"/>
-      </w:pPr>
-    </w:lvl>
-    <w:lvl w:ilvl="8">
-      <w:start w:val="1"/>
-      <w:numFmt w:val="decimal"/>
-      <w:lvlText w:val="%9."/>
-      <w:lvlJc w:val="left"/>
-      <w:pPr>
-        <w:ind w:left="6480" w:hanging="360"/>
-      </w:pPr>
-    </w:lvl>
-  </w:abstractNum>
-  <w:abstractNum w:abstractNumId="991">
+  <w:abstractNum w:abstractNumId="1" w15:restartNumberingAfterBreak="0">
     <w:nsid w:val="0000A991"/>
     <w:multiLevelType w:val="multilevel"/>
+    <w:tmpl w:val="3EC80656"/>
     <w:lvl w:ilvl="0">
       <w:numFmt w:val="bullet"/>
       <w:lvlText w:val=""/>
@@ -1255,11 +1291,97 @@
       </w:rPr>
     </w:lvl>
   </w:abstractNum>
-  <w:num w:numId="1000">
-    <w:abstractNumId w:val="990"/>
+  <w:abstractNum w:abstractNumId="2" w15:restartNumberingAfterBreak="0">
+    <w:nsid w:val="00A99411"/>
+    <w:multiLevelType w:val="multilevel"/>
+    <w:tmpl w:val="2D14E4EA"/>
+    <w:lvl w:ilvl="0">
+      <w:start w:val="1"/>
+      <w:numFmt w:val="decimal"/>
+      <w:lvlText w:val="%1."/>
+      <w:lvlJc w:val="left"/>
+      <w:pPr>
+        <w:ind w:left="720" w:hanging="360"/>
+      </w:pPr>
+    </w:lvl>
+    <w:lvl w:ilvl="1">
+      <w:start w:val="1"/>
+      <w:numFmt w:val="decimal"/>
+      <w:lvlText w:val="%2."/>
+      <w:lvlJc w:val="left"/>
+      <w:pPr>
+        <w:ind w:left="1440" w:hanging="360"/>
+      </w:pPr>
+    </w:lvl>
+    <w:lvl w:ilvl="2">
+      <w:start w:val="1"/>
+      <w:numFmt w:val="decimal"/>
+      <w:lvlText w:val="%3."/>
+      <w:lvlJc w:val="left"/>
+      <w:pPr>
+        <w:ind w:left="2160" w:hanging="360"/>
+      </w:pPr>
+    </w:lvl>
+    <w:lvl w:ilvl="3">
+      <w:start w:val="1"/>
+      <w:numFmt w:val="decimal"/>
+      <w:lvlText w:val="%4."/>
+      <w:lvlJc w:val="left"/>
+      <w:pPr>
+        <w:ind w:left="2880" w:hanging="360"/>
+      </w:pPr>
+    </w:lvl>
+    <w:lvl w:ilvl="4">
+      <w:start w:val="1"/>
+      <w:numFmt w:val="decimal"/>
+      <w:lvlText w:val="%5."/>
+      <w:lvlJc w:val="left"/>
+      <w:pPr>
+        <w:ind w:left="3600" w:hanging="360"/>
+      </w:pPr>
+    </w:lvl>
+    <w:lvl w:ilvl="5">
+      <w:start w:val="1"/>
+      <w:numFmt w:val="decimal"/>
+      <w:lvlText w:val="%6."/>
+      <w:lvlJc w:val="left"/>
+      <w:pPr>
+        <w:ind w:left="4320" w:hanging="360"/>
+      </w:pPr>
+    </w:lvl>
+    <w:lvl w:ilvl="6">
+      <w:start w:val="1"/>
+      <w:numFmt w:val="decimal"/>
+      <w:lvlText w:val="%7."/>
+      <w:lvlJc w:val="left"/>
+      <w:pPr>
+        <w:ind w:left="5040" w:hanging="360"/>
+      </w:pPr>
+    </w:lvl>
+    <w:lvl w:ilvl="7">
+      <w:start w:val="1"/>
+      <w:numFmt w:val="decimal"/>
+      <w:lvlText w:val="%8."/>
+      <w:lvlJc w:val="left"/>
+      <w:pPr>
+        <w:ind w:left="5760" w:hanging="360"/>
+      </w:pPr>
+    </w:lvl>
+    <w:lvl w:ilvl="8">
+      <w:start w:val="1"/>
+      <w:numFmt w:val="decimal"/>
+      <w:lvlText w:val="%9."/>
+      <w:lvlJc w:val="left"/>
+      <w:pPr>
+        <w:ind w:left="6480" w:hanging="360"/>
+      </w:pPr>
+    </w:lvl>
+  </w:abstractNum>
+  <w:num w:numId="1" w16cid:durableId="263849748">
+    <w:abstractNumId w:val="0"/>
   </w:num>
-  <w:num w:numId="1001">
-    <w:abstractNumId w:val="99411"/>
+  <w:num w:numId="2" w16cid:durableId="1208490566">
+    <w:abstractNumId w:val="2"/>
     <w:lvlOverride w:ilvl="0">
       <w:startOverride w:val="1"/>
     </w:lvlOverride>
@@ -1288,27 +1410,27 @@
       <w:startOverride w:val="1"/>
     </w:lvlOverride>
   </w:num>
-  <w:num w:numId="1002">
-    <w:abstractNumId w:val="991"/>
+  <w:num w:numId="3" w16cid:durableId="1841313775">
+    <w:abstractNumId w:val="1"/>
   </w:num>
-  <w:num w:numId="1003">
-    <w:abstractNumId w:val="991"/>
+  <w:num w:numId="4" w16cid:durableId="1449736571">
+    <w:abstractNumId w:val="1"/>
   </w:num>
-  <w:num w:numId="1004">
-    <w:abstractNumId w:val="991"/>
+  <w:num w:numId="5" w16cid:durableId="1733653850">
+    <w:abstractNumId w:val="1"/>
   </w:num>
 </w:numbering>
 </file>
 
 <file path=word/styles.xml><?xml version="1.0" encoding="utf-8"?>
-<w:styles xmlns:r="http://schemas.openxmlformats.org/officeDocument/2006/relationships" xmlns:w="http://schemas.openxmlformats.org/wordprocessingml/2006/main">
+<w:styles xmlns:mc="http://schemas.openxmlformats.org/markup-compatibility/2006" xmlns:r="http://schemas.openxmlformats.org/officeDocument/2006/relationships" xmlns:w="http://schemas.openxmlformats.org/wordprocessingml/2006/main" xmlns:w14="http://schemas.microsoft.com/office/word/2010/wordml" xmlns:w15="http://schemas.microsoft.com/office/word/2012/wordml" xmlns:w16cex="http://schemas.microsoft.com/office/word/2018/wordml/cex" xmlns:w16cid="http://schemas.microsoft.com/office/word/2016/wordml/cid" xmlns:w16="http://schemas.microsoft.com/office/word/2018/wordml" xmlns:w16du="http://schemas.microsoft.com/office/word/2023/wordml/word16du" xmlns:w16sdtdh="http://schemas.microsoft.com/office/word/2020/wordml/sdtdatahash" xmlns:w16sdtfl="http://schemas.microsoft.com/office/word/2024/wordml/sdtformatlock" xmlns:w16se="http://schemas.microsoft.com/office/word/2015/wordml/symex" mc:Ignorable="w14 w15 w16se w16cid w16 w16cex w16sdtdh w16sdtfl w16du">
   <w:docDefaults>
     <w:rPrDefault>
       <w:rPr>
-        <w:rFonts w:asciiTheme="minorHAnsi" w:cstheme="minorBidi" w:eastAsiaTheme="minorEastAsia" w:hAnsiTheme="minorHAnsi"/>
+        <w:rFonts w:asciiTheme="minorHAnsi" w:eastAsiaTheme="minorEastAsia" w:hAnsiTheme="minorHAnsi" w:cstheme="minorBidi"/>
         <w:sz w:val="24"/>
         <w:szCs w:val="24"/>
-        <w:lang w:bidi="ar-SA" w:eastAsia="zh-CN" w:val="en-US"/>
+        <w:lang w:val="en-US" w:eastAsia="zh-CN" w:bidi="ar-SA"/>
       </w:rPr>
     </w:rPrDefault>
     <w:pPrDefault>
@@ -1317,168 +1439,255 @@
       </w:pPr>
     </w:pPrDefault>
   </w:docDefaults>
-  <w:latentStyles w:count="276" w:defLockedState="0" w:defQFormat="0" w:defSemiHidden="0" w:defUIPriority="0" w:defUnhideWhenUsed="0"/>
-  <w:style w:default="1" w:styleId="Normal" w:type="paragraph">
+  <w:latentStyles w:defLockedState="0" w:defUIPriority="0" w:defSemiHidden="0" w:defUnhideWhenUsed="0" w:defQFormat="0" w:count="376">
+    <w:lsdException w:name="Normal Table" w:semiHidden="1" w:unhideWhenUsed="1"/>
+    <w:lsdException w:name="Table Simple 1" w:semiHidden="1" w:unhideWhenUsed="1"/>
+    <w:lsdException w:name="Table Simple 2" w:semiHidden="1" w:unhideWhenUsed="1"/>
+    <w:lsdException w:name="Table Simple 3" w:semiHidden="1" w:unhideWhenUsed="1"/>
+    <w:lsdException w:name="Table Classic 1" w:semiHidden="1" w:unhideWhenUsed="1"/>
+    <w:lsdException w:name="Table Classic 2" w:semiHidden="1" w:unhideWhenUsed="1"/>
+    <w:lsdException w:name="Table Classic 3" w:semiHidden="1" w:unhideWhenUsed="1"/>
+    <w:lsdException w:name="Table Classic 4" w:semiHidden="1" w:unhideWhenUsed="1"/>
+    <w:lsdException w:name="Table Colorful 1" w:semiHidden="1" w:unhideWhenUsed="1"/>
+    <w:lsdException w:name="Table Colorful 2" w:semiHidden="1" w:unhideWhenUsed="1"/>
+    <w:lsdException w:name="Table Colorful 3" w:semiHidden="1" w:unhideWhenUsed="1"/>
+    <w:lsdException w:name="Table Columns 1" w:semiHidden="1" w:unhideWhenUsed="1"/>
+    <w:lsdException w:name="Table Columns 2" w:semiHidden="1" w:unhideWhenUsed="1"/>
+    <w:lsdException w:name="Table Columns 3" w:semiHidden="1" w:unhideWhenUsed="1"/>
+    <w:lsdException w:name="Table Columns 4" w:semiHidden="1" w:unhideWhenUsed="1"/>
+    <w:lsdException w:name="Table Columns 5" w:semiHidden="1" w:unhideWhenUsed="1"/>
+    <w:lsdException w:name="Table Grid 1" w:semiHidden="1" w:unhideWhenUsed="1"/>
+    <w:lsdException w:name="Table Grid 2" w:semiHidden="1" w:unhideWhenUsed="1"/>
+    <w:lsdException w:name="Table Grid 3" w:semiHidden="1" w:unhideWhenUsed="1"/>
+    <w:lsdException w:name="Table Grid 4" w:semiHidden="1" w:unhideWhenUsed="1"/>
+    <w:lsdException w:name="Table Grid 5" w:semiHidden="1" w:unhideWhenUsed="1"/>
+    <w:lsdException w:name="Table Grid 6" w:semiHidden="1" w:unhideWhenUsed="1"/>
+    <w:lsdException w:name="Table Grid 7" w:semiHidden="1" w:unhideWhenUsed="1"/>
+    <w:lsdException w:name="Table Grid 8" w:semiHidden="1" w:unhideWhenUsed="1"/>
+    <w:lsdException w:name="Table List 1" w:semiHidden="1" w:unhideWhenUsed="1"/>
+    <w:lsdException w:name="Table List 2" w:semiHidden="1" w:unhideWhenUsed="1"/>
+    <w:lsdException w:name="Table List 3" w:semiHidden="1" w:unhideWhenUsed="1"/>
+    <w:lsdException w:name="Table List 4" w:semiHidden="1" w:unhideWhenUsed="1"/>
+    <w:lsdException w:name="Table List 5" w:semiHidden="1" w:unhideWhenUsed="1"/>
+    <w:lsdException w:name="Table List 6" w:semiHidden="1" w:unhideWhenUsed="1"/>
+    <w:lsdException w:name="Table List 7" w:semiHidden="1" w:unhideWhenUsed="1"/>
+    <w:lsdException w:name="Table List 8" w:semiHidden="1" w:unhideWhenUsed="1"/>
+    <w:lsdException w:name="Table 3D effects 1" w:semiHidden="1" w:unhideWhenUsed="1"/>
+    <w:lsdException w:name="Table 3D effects 2" w:semiHidden="1" w:unhideWhenUsed="1"/>
+    <w:lsdException w:name="Table 3D effects 3" w:semiHidden="1" w:unhideWhenUsed="1"/>
+    <w:lsdException w:name="Table Contemporary" w:semiHidden="1" w:unhideWhenUsed="1"/>
+    <w:lsdException w:name="Table Elegant" w:semiHidden="1" w:unhideWhenUsed="1"/>
+    <w:lsdException w:name="Table Professional" w:semiHidden="1" w:unhideWhenUsed="1"/>
+    <w:lsdException w:name="Table Subtle 1" w:semiHidden="1" w:unhideWhenUsed="1"/>
+    <w:lsdException w:name="Table Subtle 2" w:semiHidden="1" w:unhideWhenUsed="1"/>
+    <w:lsdException w:name="Table Web 1" w:semiHidden="1" w:unhideWhenUsed="1"/>
+    <w:lsdException w:name="Table Web 2" w:semiHidden="1" w:unhideWhenUsed="1"/>
+    <w:lsdException w:name="Table Web 3" w:semiHidden="1" w:unhideWhenUsed="1"/>
+    <w:lsdException w:name="Table Theme" w:semiHidden="1" w:unhideWhenUsed="1"/>
+    <w:lsdException w:name="Light Shading"/>
+    <w:lsdException w:name="Light List"/>
+    <w:lsdException w:name="Light Grid"/>
+    <w:lsdException w:name="Medium Shading 1"/>
+    <w:lsdException w:name="Medium Shading 2"/>
+    <w:lsdException w:name="Medium List 1"/>
+    <w:lsdException w:name="Medium List 2"/>
+    <w:lsdException w:name="Medium Grid 1"/>
+    <w:lsdException w:name="Medium Grid 2"/>
+    <w:lsdException w:name="Medium Grid 3"/>
+    <w:lsdException w:name="Dark List"/>
+    <w:lsdException w:name="Colorful Shading"/>
+    <w:lsdException w:name="Colorful List"/>
+    <w:lsdException w:name="Colorful Grid"/>
+    <w:lsdException w:name="Light Shading Accent 1"/>
+    <w:lsdException w:name="Light List Accent 1"/>
+    <w:lsdException w:name="Light Grid Accent 1"/>
+    <w:lsdException w:name="Medium Shading 1 Accent 1"/>
+    <w:lsdException w:name="Medium Shading 2 Accent 1"/>
+    <w:lsdException w:name="Medium List 1 Accent 1"/>
+    <w:lsdException w:name="Medium List 2 Accent 1"/>
+    <w:lsdException w:name="Medium Grid 1 Accent 1"/>
+    <w:lsdException w:name="Medium Grid 2 Accent 1"/>
+    <w:lsdException w:name="Medium Grid 3 Accent 1"/>
+    <w:lsdException w:name="Dark List Accent 1"/>
+    <w:lsdException w:name="Colorful Shading Accent 1"/>
+    <w:lsdException w:name="Colorful List Accent 1"/>
+    <w:lsdException w:name="Colorful Grid Accent 1"/>
+    <w:lsdException w:name="Light Shading Accent 2"/>
+    <w:lsdException w:name="Light List Accent 2"/>
+    <w:lsdException w:name="Light Grid Accent 2"/>
+    <w:lsdException w:name="Medium Shading 1 Accent 2"/>
+    <w:lsdException w:name="Medium Shading 2 Accent 2"/>
+    <w:lsdException w:name="Medium List 1 Accent 2"/>
+    <w:lsdException w:name="Medium List 2 Accent 2"/>
+    <w:lsdException w:name="Medium Grid 1 Accent 2"/>
+    <w:lsdException w:name="Medium Grid 2 Accent 2"/>
+    <w:lsdException w:name="Medium Grid 3 Accent 2"/>
+    <w:lsdException w:name="Dark List Accent 2"/>
+    <w:lsdException w:name="Colorful Shading Accent 2"/>
+    <w:lsdException w:name="Colorful List Accent 2"/>
+    <w:lsdException w:name="Colorful Grid Accent 2"/>
+    <w:lsdException w:name="Light Shading Accent 3"/>
+    <w:lsdException w:name="Light List Accent 3"/>
+    <w:lsdException w:name="Light Grid Accent 3"/>
+    <w:lsdException w:name="Medium Shading 1 Accent 3"/>
+    <w:lsdException w:name="Medium Shading 2 Accent 3"/>
+    <w:lsdException w:name="Medium List 1 Accent 3"/>
+    <w:lsdException w:name="Medium List 2 Accent 3"/>
+    <w:lsdException w:name="Medium Grid 1 Accent 3"/>
+    <w:lsdException w:name="Medium Grid 2 Accent 3"/>
+    <w:lsdException w:name="Medium Grid 3 Accent 3"/>
+    <w:lsdException w:name="Dark List Accent 3"/>
+    <w:lsdException w:name="Colorful Shading Accent 3"/>
+    <w:lsdException w:name="Colorful List Accent 3"/>
+    <w:lsdException w:name="Colorful Grid Accent 3"/>
+    <w:lsdException w:name="Light Shading Accent 4"/>
+    <w:lsdException w:name="Light List Accent 4"/>
+    <w:lsdException w:name="Light Grid Accent 4"/>
+    <w:lsdException w:name="Medium Shading 1 Accent 4"/>
+    <w:lsdException w:name="Medium Shading 2 Accent 4"/>
+    <w:lsdException w:name="Medium List 1 Accent 4"/>
+    <w:lsdException w:name="Medium List 2 Accent 4"/>
+    <w:lsdException w:name="Medium Grid 1 Accent 4"/>
+    <w:lsdException w:name="Medium Grid 2 Accent 4"/>
+    <w:lsdException w:name="Medium Grid 3 Accent 4"/>
+    <w:lsdException w:name="Dark List Accent 4"/>
+    <w:lsdException w:name="Colorful Shading Accent 4"/>
+    <w:lsdException w:name="Colorful List Accent 4"/>
+    <w:lsdException w:name="Colorful Grid Accent 4"/>
+    <w:lsdException w:name="Light Shading Accent 5"/>
+    <w:lsdException w:name="Light List Accent 5"/>
+    <w:lsdException w:name="Light Grid Accent 5"/>
+    <w:lsdException w:name="Medium Shading 1 Accent 5"/>
+    <w:lsdException w:name="Medium Shading 2 Accent 5"/>
+    <w:lsdException w:name="Medium List 1 Accent 5"/>
+    <w:lsdException w:name="Medium List 2 Accent 5"/>
+    <w:lsdException w:name="Medium Grid 1 Accent 5"/>
+    <w:lsdException w:name="Medium Grid 2 Accent 5"/>
+    <w:lsdException w:name="Medium Grid 3 Accent 5"/>
+    <w:lsdException w:name="Dark List Accent 5"/>
+    <w:lsdException w:name="Colorful Shading Accent 5"/>
+    <w:lsdException w:name="Colorful List Accent 5"/>
+    <w:lsdException w:name="Colorful Grid Accent 5"/>
+    <w:lsdException w:name="Light Shading Accent 6"/>
+    <w:lsdException w:name="Light List Accent 6"/>
+    <w:lsdException w:name="Light Grid Accent 6"/>
+    <w:lsdException w:name="Medium Shading 1 Accent 6"/>
+    <w:lsdException w:name="Medium Shading 2 Accent 6"/>
+    <w:lsdException w:name="Medium List 1 Accent 6"/>
+    <w:lsdException w:name="Medium List 2 Accent 6"/>
+    <w:lsdException w:name="Medium Grid 1 Accent 6"/>
+    <w:lsdException w:name="Medium Grid 2 Accent 6"/>
+    <w:lsdException w:name="Medium Grid 3 Accent 6"/>
+    <w:lsdException w:name="Dark List Accent 6"/>
+    <w:lsdException w:name="Colorful Shading Accent 6"/>
+    <w:lsdException w:name="Colorful List Accent 6"/>
+    <w:lsdException w:name="Colorful Grid Accent 6"/>
+    <w:lsdException w:name="Grid Table 4" w:uiPriority="49"/>
+    <w:lsdException w:name="Grid Table 5 Dark" w:uiPriority="50"/>
+    <w:lsdException w:name="Grid Table 6 Colorful" w:uiPriority="51"/>
+    <w:lsdException w:name="Grid Table 7 Colorful" w:uiPriority="52"/>
+    <w:lsdException w:name="Grid Table 1 Light Accent 1" w:uiPriority="46"/>
+    <w:lsdException w:name="Grid Table 2 Accent 1" w:uiPriority="47"/>
+    <w:lsdException w:name="Grid Table 3 Accent 1" w:uiPriority="48"/>
+    <w:lsdException w:name="Grid Table 4 Accent 1" w:uiPriority="49"/>
+    <w:lsdException w:name="Grid Table 5 Dark Accent 1" w:uiPriority="50"/>
+    <w:lsdException w:name="Grid Table 6 Colorful Accent 1" w:uiPriority="51"/>
+    <w:lsdException w:name="Grid Table 7 Colorful Accent 1" w:uiPriority="52"/>
+    <w:lsdException w:name="Grid Table 1 Light Accent 2" w:uiPriority="46"/>
+    <w:lsdException w:name="Grid Table 2 Accent 2" w:uiPriority="47"/>
+    <w:lsdException w:name="Grid Table 3 Accent 2" w:uiPriority="48"/>
+    <w:lsdException w:name="Grid Table 4 Accent 2" w:uiPriority="49"/>
+    <w:lsdException w:name="Grid Table 5 Dark Accent 2" w:uiPriority="50"/>
+    <w:lsdException w:name="Grid Table 6 Colorful Accent 2" w:uiPriority="51"/>
+    <w:lsdException w:name="Grid Table 7 Colorful Accent 2" w:uiPriority="52"/>
+    <w:lsdException w:name="Grid Table 1 Light Accent 3" w:uiPriority="46"/>
+    <w:lsdException w:name="Grid Table 2 Accent 3" w:uiPriority="47"/>
+    <w:lsdException w:name="Grid Table 3 Accent 3" w:uiPriority="48"/>
+    <w:lsdException w:name="Grid Table 4 Accent 3" w:uiPriority="49"/>
+    <w:lsdException w:name="Grid Table 5 Dark Accent 3" w:uiPriority="50"/>
+    <w:lsdException w:name="Grid Table 6 Colorful Accent 3" w:uiPriority="51"/>
+    <w:lsdException w:name="Grid Table 7 Colorful Accent 3" w:uiPriority="52"/>
+    <w:lsdException w:name="Grid Table 1 Light Accent 4" w:uiPriority="46"/>
+    <w:lsdException w:name="Grid Table 2 Accent 4" w:uiPriority="47"/>
+    <w:lsdException w:name="Grid Table 3 Accent 4" w:uiPriority="48"/>
+    <w:lsdException w:name="Grid Table 4 Accent 4" w:uiPriority="49"/>
+    <w:lsdException w:name="Grid Table 5 Dark Accent 4" w:uiPriority="50"/>
+    <w:lsdException w:name="Grid Table 6 Colorful Accent 4" w:uiPriority="51"/>
+    <w:lsdException w:name="Grid Table 7 Colorful Accent 4" w:uiPriority="52"/>
+    <w:lsdException w:name="Grid Table 1 Light Accent 5" w:uiPriority="46"/>
+    <w:lsdException w:name="Grid Table 2 Accent 5" w:uiPriority="47"/>
+    <w:lsdException w:name="Grid Table 3 Accent 5" w:uiPriority="48"/>
+    <w:lsdException w:name="Grid Table 4 Accent 5" w:uiPriority="49"/>
+    <w:lsdException w:name="Grid Table 5 Dark Accent 5" w:uiPriority="50"/>
+    <w:lsdException w:name="Grid Table 6 Colorful Accent 5" w:uiPriority="51"/>
+    <w:lsdException w:name="Grid Table 7 Colorful Accent 5" w:uiPriority="52"/>
+    <w:lsdException w:name="Grid Table 1 Light Accent 6" w:uiPriority="46"/>
+    <w:lsdException w:name="Grid Table 2 Accent 6" w:uiPriority="47"/>
+    <w:lsdException w:name="Grid Table 3 Accent 6" w:uiPriority="48"/>
+    <w:lsdException w:name="Grid Table 4 Accent 6" w:uiPriority="49"/>
+    <w:lsdException w:name="Grid Table 5 Dark Accent 6" w:uiPriority="50"/>
+    <w:lsdException w:name="Grid Table 6 Colorful Accent 6" w:uiPriority="51"/>
+    <w:lsdException w:name="Grid Table 7 Colorful Accent 6" w:uiPriority="52"/>
+    <w:lsdException w:name="List Table 1 Light" w:uiPriority="46"/>
+    <w:lsdException w:name="List Table 2" w:uiPriority="47"/>
+    <w:lsdException w:name="List Table 3" w:uiPriority="48"/>
+    <w:lsdException w:name="List Table 4" w:uiPriority="49"/>
+    <w:lsdException w:name="List Table 5 Dark" w:uiPriority="50"/>
+    <w:lsdException w:name="List Table 6 Colorful" w:uiPriority="51"/>
+    <w:lsdException w:name="List Table 7 Colorful" w:uiPriority="52"/>
+    <w:lsdException w:name="List Table 1 Light Accent 1" w:uiPriority="46"/>
+    <w:lsdException w:name="List Table 2 Accent 1" w:uiPriority="47"/>
+    <w:lsdException w:name="List Table 3 Accent 1" w:uiPriority="48"/>
+    <w:lsdException w:name="List Table 4 Accent 1" w:uiPriority="49"/>
+    <w:lsdException w:name="List Table 5 Dark Accent 1" w:uiPriority="50"/>
+    <w:lsdException w:name="List Table 6 Colorful Accent 1" w:uiPriority="51"/>
+    <w:lsdException w:name="List Table 7 Colorful Accent 1" w:uiPriority="52"/>
+    <w:lsdException w:name="List Table 1 Light Accent 2" w:uiPriority="46"/>
+    <w:lsdException w:name="List Table 2 Accent 2" w:uiPriority="47"/>
+    <w:lsdException w:name="List Table 3 Accent 2" w:uiPriority="48"/>
+    <w:lsdException w:name="List Table 4 Accent 2" w:uiPriority="49"/>
+    <w:lsdException w:name="List Table 5 Dark Accent 2" w:uiPriority="50"/>
+    <w:lsdException w:name="List Table 6 Colorful Accent 2" w:uiPriority="51"/>
+    <w:lsdException w:name="List Table 7 Colorful Accent 2" w:uiPriority="52"/>
+    <w:lsdException w:name="List Table 1 Light Accent 3" w:uiPriority="46"/>
+    <w:lsdException w:name="List Table 2 Accent 3" w:uiPriority="47"/>
+    <w:lsdException w:name="List Table 3 Accent 3" w:uiPriority="48"/>
+    <w:lsdException w:name="List Table 4 Accent 3" w:uiPriority="49"/>
+    <w:lsdException w:name="List Table 5 Dark Accent 3" w:uiPriority="50"/>
+    <w:lsdException w:name="List Table 6 Colorful Accent 3" w:uiPriority="51"/>
+    <w:lsdException w:name="List Table 7 Colorful Accent 3" w:uiPriority="52"/>
+    <w:lsdException w:name="List Table 1 Light Accent 4" w:uiPriority="46"/>
+    <w:lsdException w:name="List Table 2 Accent 4" w:uiPriority="47"/>
+    <w:lsdException w:name="List Table 3 Accent 4" w:uiPriority="48"/>
+    <w:lsdException w:name="List Table 4 Accent 4" w:uiPriority="49"/>
+    <w:lsdException w:name="List Table 5 Dark Accent 4" w:uiPriority="50"/>
+    <w:lsdException w:name="List Table 6 Colorful Accent 4" w:uiPriority="51"/>
+    <w:lsdException w:name="List Table 7 Colorful Accent 4" w:uiPriority="52"/>
+    <w:lsdException w:name="List Table 1 Light Accent 5" w:uiPriority="46"/>
+    <w:lsdException w:name="List Table 2 Accent 5" w:uiPriority="47"/>
+    <w:lsdException w:name="List Table 3 Accent 5" w:uiPriority="48"/>
+    <w:lsdException w:name="List Table 4 Accent 5" w:uiPriority="49"/>
+    <w:lsdException w:name="List Table 5 Dark Accent 5" w:uiPriority="50"/>
+    <w:lsdException w:name="List Table 6 Colorful Accent 5" w:uiPriority="51"/>
+    <w:lsdException w:name="List Table 7 Colorful Accent 5" w:uiPriority="52"/>
+    <w:lsdException w:name="List Table 1 Light Accent 6" w:uiPriority="46"/>
+    <w:lsdException w:name="List Table 2 Accent 6" w:uiPriority="47"/>
+    <w:lsdException w:name="List Table 3 Accent 6" w:uiPriority="48"/>
+    <w:lsdException w:name="List Table 4 Accent 6" w:uiPriority="49"/>
+    <w:lsdException w:name="List Table 5 Dark Accent 6" w:uiPriority="50"/>
+    <w:lsdException w:name="List Table 6 Colorful Accent 6" w:uiPriority="51"/>
+    <w:lsdException w:name="List Table 7 Colorful Accent 6" w:uiPriority="52"/>
+    <w:lsdException w:name="Mention" w:semiHidden="1" w:uiPriority="99" w:unhideWhenUsed="1"/>
+    <w:lsdException w:name="Smart Hyperlink" w:semiHidden="1" w:uiPriority="99" w:unhideWhenUsed="1"/>
+    <w:lsdException w:name="Hashtag" w:semiHidden="1" w:uiPriority="99" w:unhideWhenUsed="1"/>
+    <w:lsdException w:name="Unresolved Mention" w:semiHidden="1" w:uiPriority="99" w:unhideWhenUsed="1"/>
+    <w:lsdException w:name="Smart Link" w:semiHidden="1" w:uiPriority="99" w:unhideWhenUsed="1"/>
+  </w:latentStyles>
+  <w:style w:type="paragraph" w:default="1" w:styleId="Normal">
     <w:name w:val="Normal"/>
     <w:qFormat/>
   </w:style>
-  <w:style w:styleId="BodyText" w:type="paragraph">
-    <w:name w:val="Body Text"/>
-    <w:basedOn w:val="Normal"/>
-    <w:link w:val="BodyTextChar"/>
-    <w:qFormat/>
-    <w:pPr>
-      <w:spacing w:after="180" w:before="180"/>
-    </w:pPr>
-  </w:style>
-  <w:style w:customStyle="1" w:styleId="FirstParagraph" w:type="paragraph">
-    <w:name w:val="First Paragraph"/>
-    <w:basedOn w:val="BodyText"/>
-    <w:next w:val="BodyText"/>
-    <w:qFormat/>
-  </w:style>
-  <w:style w:customStyle="1" w:styleId="Compact" w:type="paragraph">
-    <w:name w:val="Compact"/>
-    <w:basedOn w:val="BodyText"/>
-    <w:qFormat/>
-    <w:pPr>
-      <w:spacing w:after="36" w:before="36"/>
-    </w:pPr>
-  </w:style>
-  <w:style w:styleId="Title" w:type="paragraph">
-    <w:name w:val="Title"/>
-    <w:basedOn w:val="Normal"/>
-    <w:next w:val="BodyText"/>
-    <w:link w:val="TitleChar"/>
-    <w:uiPriority w:val="10"/>
-    <w:qFormat/>
-    <w:rsid w:val="00A10FD9"/>
-    <w:pPr>
-      <w:spacing w:after="80" w:line="240" w:lineRule="auto"/>
-      <w:contextualSpacing/>
-      <w:jc w:val="center"/>
-    </w:pPr>
-    <w:rPr>
-      <w:rFonts w:asciiTheme="majorHAnsi" w:cstheme="majorBidi" w:eastAsiaTheme="majorEastAsia" w:hAnsiTheme="majorHAnsi"/>
-      <w:sz w:val="56"/>
-      <w:szCs w:val="56"/>
-    </w:rPr>
-  </w:style>
-  <w:style w:customStyle="1" w:styleId="TitleChar" w:type="character">
-    <w:name w:val="Title Char"/>
-    <w:basedOn w:val="DefaultParagraphFont"/>
-    <w:link w:val="Title"/>
-    <w:uiPriority w:val="10"/>
-    <w:rsid w:val="00A10FD9"/>
-    <w:rPr>
-      <w:rFonts w:asciiTheme="majorHAnsi" w:cstheme="majorBidi" w:eastAsiaTheme="majorEastAsia" w:hAnsiTheme="majorHAnsi"/>
-      <w:sz w:val="56"/>
-      <w:szCs w:val="56"/>
-    </w:rPr>
-  </w:style>
-  <w:style w:styleId="Subtitle" w:type="paragraph">
-    <w:name w:val="Subtitle"/>
-    <w:basedOn w:val="Title"/>
-    <w:next w:val="BodyText"/>
-    <w:link w:val="SubtitleChar"/>
-    <w:uiPriority w:val="11"/>
-    <w:qFormat/>
-    <w:rsid w:val="00A10FD9"/>
-    <w:pPr>
-      <w:numPr>
-        <w:ilvl w:val="1"/>
-      </w:numPr>
-    </w:pPr>
-    <w:rPr>
-      <w:rFonts w:cstheme="majorBidi" w:eastAsiaTheme="majorEastAsia"/>
-      <w:spacing w:val="15"/>
-      <w:sz w:val="28"/>
-      <w:szCs w:val="28"/>
-    </w:rPr>
-  </w:style>
-  <w:style w:customStyle="1" w:styleId="SubtitleChar" w:type="character">
-    <w:name w:val="Subtitle Char"/>
-    <w:basedOn w:val="DefaultParagraphFont"/>
-    <w:link w:val="Subtitle"/>
-    <w:uiPriority w:val="11"/>
-    <w:rsid w:val="00A10FD9"/>
-    <w:rPr>
-      <w:rFonts w:cstheme="majorBidi" w:eastAsiaTheme="majorEastAsia"/>
-      <w:color w:themeColor="text1" w:themeTint="A6" w:val="595959"/>
-      <w:spacing w:val="15"/>
-      <w:sz w:val="28"/>
-      <w:szCs w:val="28"/>
-    </w:rPr>
-  </w:style>
-  <w:style w:customStyle="1" w:styleId="Author" w:type="paragraph">
-    <w:name w:val="Author"/>
-    <w:basedOn w:val="Title"/>
-    <w:next w:val="BodyText"/>
-    <w:qFormat/>
-    <w:pPr>
-      <w:keepNext/>
-      <w:keepLines/>
-    </w:pPr>
-    <w:rPr>
-      <w:sz w:val="24"/>
-      <w:szCs w:val="24"/>
-    </w:rPr>
-  </w:style>
-  <w:style w:styleId="Date" w:type="paragraph">
-    <w:name w:val="Date"/>
-    <w:basedOn w:val="Title"/>
-    <w:next w:val="BodyText"/>
-    <w:qFormat/>
-    <w:pPr>
-      <w:keepNext/>
-      <w:keepLines/>
-    </w:pPr>
-    <w:rPr>
-      <w:sz w:val="24"/>
-      <w:szCs w:val="24"/>
-    </w:rPr>
-  </w:style>
-  <w:style w:customStyle="1" w:styleId="AbstractTitle" w:type="paragraph">
-    <w:name w:val="Abstract Title"/>
-    <w:basedOn w:val="Normal"/>
-    <w:next w:val="Abstract"/>
-    <w:qFormat/>
-    <w:pPr>
-      <w:keepNext/>
-      <w:keepLines/>
-      <w:spacing w:after="0" w:before="300"/>
-      <w:jc w:val="center"/>
-    </w:pPr>
-    <w:rPr>
-      <w:b/>
-      <w:sz w:val="20"/>
-      <w:szCs w:val="20"/>
-    </w:rPr>
-  </w:style>
-  <w:style w:customStyle="1" w:styleId="Abstract" w:type="paragraph">
-    <w:name w:val="Abstract"/>
-    <w:basedOn w:val="Normal"/>
-    <w:next w:val="BodyText"/>
-    <w:qFormat/>
-    <w:pPr>
-      <w:keepNext/>
-      <w:keepLines/>
-      <w:spacing w:after="300" w:before="100"/>
-    </w:pPr>
-    <w:rPr>
-      <w:sz w:val="20"/>
-      <w:szCs w:val="20"/>
-    </w:rPr>
-  </w:style>
-  <w:style w:styleId="Bibliography" w:type="paragraph">
-    <w:name w:val="Bibliography"/>
-    <w:basedOn w:val="Normal"/>
-    <w:next w:val="Bibliography"/>
-    <w:qFormat/>
-    <w:pPr/>
-    <w:rPr/>
-  </w:style>
-  <w:style w:styleId="Heading1" w:type="paragraph">
+  <w:style w:type="paragraph" w:styleId="Heading1">
     <w:name w:val="heading 1"/>
     <w:basedOn w:val="Normal"/>
     <w:next w:val="BodyText"/>
@@ -1489,17 +1698,17 @@
     <w:pPr>
       <w:keepNext/>
       <w:keepLines/>
-      <w:spacing w:after="80" w:before="360"/>
+      <w:spacing w:before="360" w:after="80"/>
       <w:outlineLvl w:val="0"/>
     </w:pPr>
     <w:rPr>
-      <w:rFonts w:asciiTheme="majorHAnsi" w:cstheme="majorBidi" w:eastAsiaTheme="majorEastAsia" w:hAnsiTheme="majorHAnsi"/>
-      <w:color w:themeColor="accent1" w:themeShade="BF" w:val="0F4761"/>
+      <w:rFonts w:asciiTheme="majorHAnsi" w:eastAsiaTheme="majorEastAsia" w:hAnsiTheme="majorHAnsi" w:cstheme="majorBidi"/>
+      <w:color w:val="0F4761" w:themeColor="accent1" w:themeShade="BF"/>
       <w:sz w:val="40"/>
       <w:szCs w:val="40"/>
     </w:rPr>
   </w:style>
-  <w:style w:styleId="Heading2" w:type="paragraph">
+  <w:style w:type="paragraph" w:styleId="Heading2">
     <w:name w:val="heading 2"/>
     <w:basedOn w:val="Normal"/>
     <w:next w:val="BodyText"/>
@@ -1512,17 +1721,17 @@
     <w:pPr>
       <w:keepNext/>
       <w:keepLines/>
-      <w:spacing w:after="80" w:before="160"/>
+      <w:spacing w:before="160" w:after="80"/>
       <w:outlineLvl w:val="1"/>
     </w:pPr>
     <w:rPr>
-      <w:rFonts w:asciiTheme="majorHAnsi" w:cstheme="majorBidi" w:eastAsiaTheme="majorEastAsia" w:hAnsiTheme="majorHAnsi"/>
-      <w:color w:themeColor="accent1" w:themeShade="BF" w:val="0F4761"/>
+      <w:rFonts w:asciiTheme="majorHAnsi" w:eastAsiaTheme="majorEastAsia" w:hAnsiTheme="majorHAnsi" w:cstheme="majorBidi"/>
+      <w:color w:val="0F4761" w:themeColor="accent1" w:themeShade="BF"/>
       <w:sz w:val="32"/>
       <w:szCs w:val="32"/>
     </w:rPr>
   </w:style>
-  <w:style w:styleId="Heading3" w:type="paragraph">
+  <w:style w:type="paragraph" w:styleId="Heading3">
     <w:name w:val="heading 3"/>
     <w:basedOn w:val="Normal"/>
     <w:next w:val="BodyText"/>
@@ -1535,17 +1744,17 @@
     <w:pPr>
       <w:keepNext/>
       <w:keepLines/>
-      <w:spacing w:after="80" w:before="160"/>
+      <w:spacing w:before="160" w:after="80"/>
       <w:outlineLvl w:val="2"/>
     </w:pPr>
     <w:rPr>
-      <w:rFonts w:cstheme="majorBidi" w:eastAsiaTheme="majorEastAsia"/>
-      <w:color w:themeColor="accent1" w:themeShade="BF" w:val="0F4761"/>
+      <w:rFonts w:eastAsiaTheme="majorEastAsia" w:cstheme="majorBidi"/>
+      <w:color w:val="0F4761" w:themeColor="accent1" w:themeShade="BF"/>
       <w:sz w:val="28"/>
       <w:szCs w:val="28"/>
     </w:rPr>
   </w:style>
-  <w:style w:styleId="Heading4" w:type="paragraph">
+  <w:style w:type="paragraph" w:styleId="Heading4">
     <w:name w:val="heading 4"/>
     <w:basedOn w:val="Normal"/>
     <w:next w:val="BodyText"/>
@@ -1558,17 +1767,17 @@
     <w:pPr>
       <w:keepNext/>
       <w:keepLines/>
-      <w:spacing w:after="40" w:before="80"/>
+      <w:spacing w:before="80" w:after="40"/>
       <w:outlineLvl w:val="3"/>
     </w:pPr>
     <w:rPr>
-      <w:rFonts w:cstheme="majorBidi" w:eastAsiaTheme="majorEastAsia"/>
+      <w:rFonts w:eastAsiaTheme="majorEastAsia" w:cstheme="majorBidi"/>
       <w:i/>
       <w:iCs/>
-      <w:color w:themeColor="accent1" w:themeShade="BF" w:val="0F4761"/>
-    </w:rPr>
-  </w:style>
-  <w:style w:styleId="Heading5" w:type="paragraph">
+      <w:color w:val="0F4761" w:themeColor="accent1" w:themeShade="BF"/>
+    </w:rPr>
+  </w:style>
+  <w:style w:type="paragraph" w:styleId="Heading5">
     <w:name w:val="heading 5"/>
     <w:basedOn w:val="Normal"/>
     <w:next w:val="BodyText"/>
@@ -1581,15 +1790,15 @@
     <w:pPr>
       <w:keepNext/>
       <w:keepLines/>
-      <w:spacing w:after="40" w:before="80"/>
+      <w:spacing w:before="80" w:after="40"/>
       <w:outlineLvl w:val="4"/>
     </w:pPr>
     <w:rPr>
-      <w:rFonts w:cstheme="majorBidi" w:eastAsiaTheme="majorEastAsia"/>
-      <w:color w:themeColor="accent1" w:themeShade="BF" w:val="0F4761"/>
-    </w:rPr>
-  </w:style>
-  <w:style w:styleId="Heading6" w:type="paragraph">
+      <w:rFonts w:eastAsiaTheme="majorEastAsia" w:cstheme="majorBidi"/>
+      <w:color w:val="0F4761" w:themeColor="accent1" w:themeShade="BF"/>
+    </w:rPr>
+  </w:style>
+  <w:style w:type="paragraph" w:styleId="Heading6">
     <w:name w:val="heading 6"/>
     <w:basedOn w:val="Normal"/>
     <w:next w:val="BodyText"/>
@@ -1602,17 +1811,17 @@
     <w:pPr>
       <w:keepNext/>
       <w:keepLines/>
-      <w:spacing w:after="0" w:before="40"/>
+      <w:spacing w:before="40" w:after="0"/>
       <w:outlineLvl w:val="5"/>
     </w:pPr>
     <w:rPr>
-      <w:rFonts w:cstheme="majorBidi" w:eastAsiaTheme="majorEastAsia"/>
+      <w:rFonts w:eastAsiaTheme="majorEastAsia" w:cstheme="majorBidi"/>
       <w:i/>
       <w:iCs/>
-      <w:color w:themeColor="text1" w:themeTint="A6" w:val="595959"/>
-    </w:rPr>
-  </w:style>
-  <w:style w:styleId="Heading7" w:type="paragraph">
+      <w:color w:val="595959" w:themeColor="text1" w:themeTint="A6"/>
+    </w:rPr>
+  </w:style>
+  <w:style w:type="paragraph" w:styleId="Heading7">
     <w:name w:val="heading 7"/>
     <w:basedOn w:val="Normal"/>
     <w:next w:val="BodyText"/>
@@ -1625,15 +1834,15 @@
     <w:pPr>
       <w:keepNext/>
       <w:keepLines/>
-      <w:spacing w:after="0" w:before="40"/>
+      <w:spacing w:before="40" w:after="0"/>
       <w:outlineLvl w:val="6"/>
     </w:pPr>
     <w:rPr>
-      <w:rFonts w:cstheme="majorBidi" w:eastAsiaTheme="majorEastAsia"/>
-      <w:color w:themeColor="text1" w:themeTint="A6" w:val="595959"/>
-    </w:rPr>
-  </w:style>
-  <w:style w:styleId="Heading8" w:type="paragraph">
+      <w:rFonts w:eastAsiaTheme="majorEastAsia" w:cstheme="majorBidi"/>
+      <w:color w:val="595959" w:themeColor="text1" w:themeTint="A6"/>
+    </w:rPr>
+  </w:style>
+  <w:style w:type="paragraph" w:styleId="Heading8">
     <w:name w:val="heading 8"/>
     <w:basedOn w:val="Normal"/>
     <w:next w:val="BodyText"/>
@@ -1650,13 +1859,13 @@
       <w:outlineLvl w:val="7"/>
     </w:pPr>
     <w:rPr>
-      <w:rFonts w:cstheme="majorBidi" w:eastAsiaTheme="majorEastAsia"/>
+      <w:rFonts w:eastAsiaTheme="majorEastAsia" w:cstheme="majorBidi"/>
       <w:i/>
       <w:iCs/>
-      <w:color w:themeColor="text1" w:themeTint="D8" w:val="272727"/>
-    </w:rPr>
-  </w:style>
-  <w:style w:styleId="Heading9" w:type="paragraph">
+      <w:color w:val="272727" w:themeColor="text1" w:themeTint="D8"/>
+    </w:rPr>
+  </w:style>
+  <w:style w:type="paragraph" w:styleId="Heading9">
     <w:name w:val="heading 9"/>
     <w:basedOn w:val="Normal"/>
     <w:next w:val="BodyText"/>
@@ -1673,24 +1882,202 @@
       <w:outlineLvl w:val="8"/>
     </w:pPr>
     <w:rPr>
-      <w:rFonts w:cstheme="majorBidi" w:eastAsiaTheme="majorEastAsia"/>
-      <w:color w:themeColor="text1" w:themeTint="D8" w:val="272727"/>
-    </w:rPr>
-  </w:style>
-  <w:style w:customStyle="1" w:styleId="Heading1Char" w:type="character">
+      <w:rFonts w:eastAsiaTheme="majorEastAsia" w:cstheme="majorBidi"/>
+      <w:color w:val="272727" w:themeColor="text1" w:themeTint="D8"/>
+    </w:rPr>
+  </w:style>
+  <w:style w:type="character" w:default="1" w:styleId="DefaultParagraphFont">
+    <w:name w:val="Default Paragraph Font"/>
+    <w:uiPriority w:val="1"/>
+    <w:semiHidden/>
+    <w:unhideWhenUsed/>
+  </w:style>
+  <w:style w:type="table" w:default="1" w:styleId="TableNormal">
+    <w:name w:val="Normal Table"/>
+    <w:uiPriority w:val="99"/>
+    <w:semiHidden/>
+    <w:unhideWhenUsed/>
+    <w:tblPr>
+      <w:tblInd w:w="0" w:type="dxa"/>
+      <w:tblCellMar>
+        <w:top w:w="0" w:type="dxa"/>
+        <w:left w:w="108" w:type="dxa"/>
+        <w:bottom w:w="0" w:type="dxa"/>
+        <w:right w:w="108" w:type="dxa"/>
+      </w:tblCellMar>
+    </w:tblPr>
+  </w:style>
+  <w:style w:type="numbering" w:default="1" w:styleId="NoList">
+    <w:name w:val="No List"/>
+    <w:uiPriority w:val="99"/>
+    <w:semiHidden/>
+    <w:unhideWhenUsed/>
+  </w:style>
+  <w:style w:type="paragraph" w:styleId="BodyText">
+    <w:name w:val="Body Text"/>
+    <w:basedOn w:val="Normal"/>
+    <w:qFormat/>
+    <w:pPr>
+      <w:spacing w:before="180" w:after="180"/>
+    </w:pPr>
+  </w:style>
+  <w:style w:type="paragraph" w:customStyle="1" w:styleId="FirstParagraph">
+    <w:name w:val="First Paragraph"/>
+    <w:basedOn w:val="BodyText"/>
+    <w:next w:val="BodyText"/>
+    <w:qFormat/>
+  </w:style>
+  <w:style w:type="paragraph" w:customStyle="1" w:styleId="Compact">
+    <w:name w:val="Compact"/>
+    <w:basedOn w:val="BodyText"/>
+    <w:qFormat/>
+    <w:pPr>
+      <w:spacing w:before="36" w:after="36"/>
+    </w:pPr>
+  </w:style>
+  <w:style w:type="paragraph" w:styleId="Title">
+    <w:name w:val="Title"/>
+    <w:basedOn w:val="Normal"/>
+    <w:next w:val="BodyText"/>
+    <w:link w:val="TitleChar"/>
+    <w:uiPriority w:val="10"/>
+    <w:qFormat/>
+    <w:rsid w:val="00A10FD9"/>
+    <w:pPr>
+      <w:spacing w:after="80"/>
+      <w:contextualSpacing/>
+      <w:jc w:val="center"/>
+    </w:pPr>
+    <w:rPr>
+      <w:rFonts w:asciiTheme="majorHAnsi" w:eastAsiaTheme="majorEastAsia" w:hAnsiTheme="majorHAnsi" w:cstheme="majorBidi"/>
+      <w:sz w:val="56"/>
+      <w:szCs w:val="56"/>
+    </w:rPr>
+  </w:style>
+  <w:style w:type="character" w:customStyle="1" w:styleId="TitleChar">
+    <w:name w:val="Title Char"/>
+    <w:basedOn w:val="DefaultParagraphFont"/>
+    <w:link w:val="Title"/>
+    <w:uiPriority w:val="10"/>
+    <w:rsid w:val="00A10FD9"/>
+    <w:rPr>
+      <w:rFonts w:asciiTheme="majorHAnsi" w:eastAsiaTheme="majorEastAsia" w:hAnsiTheme="majorHAnsi" w:cstheme="majorBidi"/>
+      <w:sz w:val="56"/>
+      <w:szCs w:val="56"/>
+    </w:rPr>
+  </w:style>
+  <w:style w:type="paragraph" w:styleId="Subtitle">
+    <w:name w:val="Subtitle"/>
+    <w:basedOn w:val="Title"/>
+    <w:next w:val="BodyText"/>
+    <w:link w:val="SubtitleChar"/>
+    <w:uiPriority w:val="11"/>
+    <w:qFormat/>
+    <w:rsid w:val="00A10FD9"/>
+    <w:pPr>
+      <w:numPr>
+        <w:ilvl w:val="1"/>
+      </w:numPr>
+    </w:pPr>
+    <w:rPr>
+      <w:spacing w:val="15"/>
+      <w:sz w:val="28"/>
+      <w:szCs w:val="28"/>
+    </w:rPr>
+  </w:style>
+  <w:style w:type="character" w:customStyle="1" w:styleId="SubtitleChar">
+    <w:name w:val="Subtitle Char"/>
+    <w:basedOn w:val="DefaultParagraphFont"/>
+    <w:link w:val="Subtitle"/>
+    <w:uiPriority w:val="11"/>
+    <w:rsid w:val="00A10FD9"/>
+    <w:rPr>
+      <w:rFonts w:eastAsiaTheme="majorEastAsia" w:cstheme="majorBidi"/>
+      <w:color w:val="595959" w:themeColor="text1" w:themeTint="A6"/>
+      <w:spacing w:val="15"/>
+      <w:sz w:val="28"/>
+      <w:szCs w:val="28"/>
+    </w:rPr>
+  </w:style>
+  <w:style w:type="paragraph" w:customStyle="1" w:styleId="Author">
+    <w:name w:val="Author"/>
+    <w:basedOn w:val="Title"/>
+    <w:next w:val="BodyText"/>
+    <w:qFormat/>
+    <w:pPr>
+      <w:keepNext/>
+      <w:keepLines/>
+    </w:pPr>
+    <w:rPr>
+      <w:sz w:val="24"/>
+      <w:szCs w:val="24"/>
+    </w:rPr>
+  </w:style>
+  <w:style w:type="paragraph" w:styleId="Date">
+    <w:name w:val="Date"/>
+    <w:basedOn w:val="Title"/>
+    <w:next w:val="BodyText"/>
+    <w:qFormat/>
+    <w:pPr>
+      <w:keepNext/>
+      <w:keepLines/>
+    </w:pPr>
+    <w:rPr>
+      <w:sz w:val="24"/>
+      <w:szCs w:val="24"/>
+    </w:rPr>
+  </w:style>
+  <w:style w:type="paragraph" w:customStyle="1" w:styleId="AbstractTitle">
+    <w:name w:val="Abstract Title"/>
+    <w:basedOn w:val="Normal"/>
+    <w:next w:val="Abstract"/>
+    <w:qFormat/>
+    <w:pPr>
+      <w:keepNext/>
+      <w:keepLines/>
+      <w:spacing w:before="300" w:after="0"/>
+      <w:jc w:val="center"/>
+    </w:pPr>
+    <w:rPr>
+      <w:b/>
+      <w:sz w:val="20"/>
+      <w:szCs w:val="20"/>
+    </w:rPr>
+  </w:style>
+  <w:style w:type="paragraph" w:customStyle="1" w:styleId="Abstract">
+    <w:name w:val="Abstract"/>
+    <w:basedOn w:val="Normal"/>
+    <w:next w:val="BodyText"/>
+    <w:qFormat/>
+    <w:pPr>
+      <w:keepNext/>
+      <w:keepLines/>
+      <w:spacing w:before="100" w:after="300"/>
+    </w:pPr>
+    <w:rPr>
+      <w:sz w:val="20"/>
+      <w:szCs w:val="20"/>
+    </w:rPr>
+  </w:style>
+  <w:style w:type="paragraph" w:styleId="Bibliography">
+    <w:name w:val="Bibliography"/>
+    <w:basedOn w:val="Normal"/>
+    <w:qFormat/>
+  </w:style>
+  <w:style w:type="character" w:customStyle="1" w:styleId="Heading1Char">
     <w:name w:val="Heading 1 Char"/>
     <w:basedOn w:val="DefaultParagraphFont"/>
     <w:link w:val="Heading1"/>
     <w:uiPriority w:val="9"/>
     <w:rsid w:val="00A10FD9"/>
     <w:rPr>
-      <w:rFonts w:asciiTheme="majorHAnsi" w:cstheme="majorBidi" w:eastAsiaTheme="majorEastAsia" w:hAnsiTheme="majorHAnsi"/>
-      <w:color w:themeColor="accent1" w:themeShade="BF" w:val="0F4761"/>
+      <w:rFonts w:asciiTheme="majorHAnsi" w:eastAsiaTheme="majorEastAsia" w:hAnsiTheme="majorHAnsi" w:cstheme="majorBidi"/>
+      <w:color w:val="0F4761" w:themeColor="accent1" w:themeShade="BF"/>
       <w:sz w:val="40"/>
       <w:szCs w:val="40"/>
     </w:rPr>
   </w:style>
-  <w:style w:customStyle="1" w:styleId="Heading2Char" w:type="character">
+  <w:style w:type="character" w:customStyle="1" w:styleId="Heading2Char">
     <w:name w:val="Heading 2 Char"/>
     <w:basedOn w:val="DefaultParagraphFont"/>
     <w:link w:val="Heading2"/>
@@ -1698,13 +2085,13 @@
     <w:semiHidden/>
     <w:rsid w:val="00A10FD9"/>
     <w:rPr>
-      <w:rFonts w:asciiTheme="majorHAnsi" w:cstheme="majorBidi" w:eastAsiaTheme="majorEastAsia" w:hAnsiTheme="majorHAnsi"/>
-      <w:color w:themeColor="accent1" w:themeShade="BF" w:val="0F4761"/>
+      <w:rFonts w:asciiTheme="majorHAnsi" w:eastAsiaTheme="majorEastAsia" w:hAnsiTheme="majorHAnsi" w:cstheme="majorBidi"/>
+      <w:color w:val="0F4761" w:themeColor="accent1" w:themeShade="BF"/>
       <w:sz w:val="32"/>
       <w:szCs w:val="32"/>
     </w:rPr>
   </w:style>
-  <w:style w:customStyle="1" w:styleId="Heading3Char" w:type="character">
+  <w:style w:type="character" w:customStyle="1" w:styleId="Heading3Char">
     <w:name w:val="Heading 3 Char"/>
     <w:basedOn w:val="DefaultParagraphFont"/>
     <w:link w:val="Heading3"/>
@@ -1712,13 +2099,13 @@
     <w:semiHidden/>
     <w:rsid w:val="00A10FD9"/>
     <w:rPr>
-      <w:rFonts w:cstheme="majorBidi" w:eastAsiaTheme="majorEastAsia"/>
-      <w:color w:themeColor="accent1" w:themeShade="BF" w:val="0F4761"/>
+      <w:rFonts w:eastAsiaTheme="majorEastAsia" w:cstheme="majorBidi"/>
+      <w:color w:val="0F4761" w:themeColor="accent1" w:themeShade="BF"/>
       <w:sz w:val="28"/>
       <w:szCs w:val="28"/>
     </w:rPr>
   </w:style>
-  <w:style w:customStyle="1" w:styleId="Heading4Char" w:type="character">
+  <w:style w:type="character" w:customStyle="1" w:styleId="Heading4Char">
     <w:name w:val="Heading 4 Char"/>
     <w:basedOn w:val="DefaultParagraphFont"/>
     <w:link w:val="Heading4"/>
@@ -1726,13 +2113,13 @@
     <w:semiHidden/>
     <w:rsid w:val="00A10FD9"/>
     <w:rPr>
-      <w:rFonts w:cstheme="majorBidi" w:eastAsiaTheme="majorEastAsia"/>
+      <w:rFonts w:eastAsiaTheme="majorEastAsia" w:cstheme="majorBidi"/>
       <w:i/>
       <w:iCs/>
-      <w:color w:themeColor="accent1" w:themeShade="BF" w:val="0F4761"/>
-    </w:rPr>
-  </w:style>
-  <w:style w:customStyle="1" w:styleId="Heading5Char" w:type="character">
+      <w:color w:val="0F4761" w:themeColor="accent1" w:themeShade="BF"/>
+    </w:rPr>
+  </w:style>
+  <w:style w:type="character" w:customStyle="1" w:styleId="Heading5Char">
     <w:name w:val="Heading 5 Char"/>
     <w:basedOn w:val="DefaultParagraphFont"/>
     <w:link w:val="Heading5"/>
@@ -1740,11 +2127,11 @@
     <w:semiHidden/>
     <w:rsid w:val="00A10FD9"/>
     <w:rPr>
-      <w:rFonts w:cstheme="majorBidi" w:eastAsiaTheme="majorEastAsia"/>
-      <w:color w:themeColor="accent1" w:themeShade="BF" w:val="0F4761"/>
-    </w:rPr>
-  </w:style>
-  <w:style w:customStyle="1" w:styleId="Heading6Char" w:type="character">
+      <w:rFonts w:eastAsiaTheme="majorEastAsia" w:cstheme="majorBidi"/>
+      <w:color w:val="0F4761" w:themeColor="accent1" w:themeShade="BF"/>
+    </w:rPr>
+  </w:style>
+  <w:style w:type="character" w:customStyle="1" w:styleId="Heading6Char">
     <w:name w:val="Heading 6 Char"/>
     <w:basedOn w:val="DefaultParagraphFont"/>
     <w:link w:val="Heading6"/>
@@ -1752,13 +2139,13 @@
     <w:semiHidden/>
     <w:rsid w:val="00A10FD9"/>
     <w:rPr>
-      <w:rFonts w:cstheme="majorBidi" w:eastAsiaTheme="majorEastAsia"/>
+      <w:rFonts w:eastAsiaTheme="majorEastAsia" w:cstheme="majorBidi"/>
       <w:i/>
       <w:iCs/>
-      <w:color w:themeColor="text1" w:themeTint="A6" w:val="595959"/>
-    </w:rPr>
-  </w:style>
-  <w:style w:customStyle="1" w:styleId="Heading7Char" w:type="character">
+      <w:color w:val="595959" w:themeColor="text1" w:themeTint="A6"/>
+    </w:rPr>
+  </w:style>
+  <w:style w:type="character" w:customStyle="1" w:styleId="Heading7Char">
     <w:name w:val="Heading 7 Char"/>
     <w:basedOn w:val="DefaultParagraphFont"/>
     <w:link w:val="Heading7"/>
@@ -1766,11 +2153,11 @@
     <w:semiHidden/>
     <w:rsid w:val="00A10FD9"/>
     <w:rPr>
-      <w:rFonts w:cstheme="majorBidi" w:eastAsiaTheme="majorEastAsia"/>
-      <w:color w:themeColor="text1" w:themeTint="A6" w:val="595959"/>
-    </w:rPr>
-  </w:style>
-  <w:style w:customStyle="1" w:styleId="Heading8Char" w:type="character">
+      <w:rFonts w:eastAsiaTheme="majorEastAsia" w:cstheme="majorBidi"/>
+      <w:color w:val="595959" w:themeColor="text1" w:themeTint="A6"/>
+    </w:rPr>
+  </w:style>
+  <w:style w:type="character" w:customStyle="1" w:styleId="Heading8Char">
     <w:name w:val="Heading 8 Char"/>
     <w:basedOn w:val="DefaultParagraphFont"/>
     <w:link w:val="Heading8"/>
@@ -1778,13 +2165,13 @@
     <w:semiHidden/>
     <w:rsid w:val="00A10FD9"/>
     <w:rPr>
-      <w:rFonts w:cstheme="majorBidi" w:eastAsiaTheme="majorEastAsia"/>
+      <w:rFonts w:eastAsiaTheme="majorEastAsia" w:cstheme="majorBidi"/>
       <w:i/>
       <w:iCs/>
-      <w:color w:themeColor="text1" w:themeTint="D8" w:val="272727"/>
-    </w:rPr>
-  </w:style>
-  <w:style w:customStyle="1" w:styleId="Heading9Char" w:type="character">
+      <w:color w:val="272727" w:themeColor="text1" w:themeTint="D8"/>
+    </w:rPr>
+  </w:style>
+  <w:style w:type="character" w:customStyle="1" w:styleId="Heading9Char">
     <w:name w:val="Heading 9 Char"/>
     <w:basedOn w:val="DefaultParagraphFont"/>
     <w:link w:val="Heading9"/>
@@ -1792,11 +2179,11 @@
     <w:semiHidden/>
     <w:rsid w:val="00A10FD9"/>
     <w:rPr>
-      <w:rFonts w:cstheme="majorBidi" w:eastAsiaTheme="majorEastAsia"/>
-      <w:color w:themeColor="text1" w:themeTint="D8" w:val="272727"/>
-    </w:rPr>
-  </w:style>
-  <w:style w:styleId="BlockText" w:type="paragraph">
+      <w:rFonts w:eastAsiaTheme="majorEastAsia" w:cstheme="majorBidi"/>
+      <w:color w:val="272727" w:themeColor="text1" w:themeTint="D8"/>
+    </w:rPr>
+  </w:style>
+  <w:style w:type="paragraph" w:styleId="BlockText">
     <w:name w:val="Block Text"/>
     <w:basedOn w:val="BodyText"/>
     <w:next w:val="BodyText"/>
@@ -1804,19 +2191,18 @@
     <w:unhideWhenUsed/>
     <w:qFormat/>
     <w:pPr>
-      <w:spacing w:after="100" w:before="100"/>
-      <w:ind w:firstLine="0" w:left="480" w:right="480"/>
+      <w:spacing w:before="100" w:after="100"/>
+      <w:ind w:left="480" w:right="480"/>
     </w:pPr>
   </w:style>
-  <w:style w:styleId="FootnoteText" w:type="paragraph">
-    <w:name w:val="Footnote Text"/>
+  <w:style w:type="paragraph" w:styleId="FootnoteText">
+    <w:name w:val="footnote text"/>
     <w:basedOn w:val="Normal"/>
-    <w:next w:val="FootnoteText"/>
     <w:uiPriority w:val="9"/>
     <w:unhideWhenUsed/>
     <w:qFormat/>
   </w:style>
-  <w:style w:styleId="FootnoteBlockText" w:type="paragraph">
+  <w:style w:type="paragraph" w:customStyle="1" w:styleId="FootnoteBlockText">
     <w:name w:val="Footnote Block Text"/>
     <w:basedOn w:val="FootnoteText"/>
     <w:next w:val="FootnoteText"/>
@@ -1824,40 +2210,35 @@
     <w:unhideWhenUsed/>
     <w:qFormat/>
     <w:pPr>
-      <w:spacing w:after="100" w:before="100"/>
-      <w:ind w:firstLine="0" w:left="480" w:right="480"/>
+      <w:spacing w:before="100" w:after="100"/>
+      <w:ind w:left="480" w:right="480"/>
     </w:pPr>
   </w:style>
-  <w:style w:default="1" w:styleId="DefaultParagraphFont" w:type="character">
-    <w:name w:val="Default Paragraph Font"/>
-    <w:semiHidden/>
-    <w:unhideWhenUsed/>
-  </w:style>
-  <w:style w:default="1" w:styleId="Table" w:type="table">
+  <w:style w:type="table" w:customStyle="1" w:styleId="Table">
     <w:name w:val="Table"/>
-    <w:basedOn w:val="TableNormal"/>
     <w:semiHidden/>
     <w:unhideWhenUsed/>
     <w:qFormat/>
     <w:tblPr>
-      <w:tblInd w:type="dxa" w:w="0"/>
+      <w:tblInd w:w="0" w:type="dxa"/>
       <w:tblCellMar>
-        <w:top w:type="dxa" w:w="0"/>
-        <w:left w:type="dxa" w:w="108"/>
-        <w:bottom w:type="dxa" w:w="0"/>
-        <w:right w:type="dxa" w:w="108"/>
+        <w:top w:w="0" w:type="dxa"/>
+        <w:left w:w="108" w:type="dxa"/>
+        <w:bottom w:w="0" w:type="dxa"/>
+        <w:right w:w="108" w:type="dxa"/>
       </w:tblCellMar>
     </w:tblPr>
     <w:tblStylePr w:type="firstRow">
+      <w:tblPr/>
       <w:tcPr>
         <w:tcBorders>
-          <w:bottom w:val="single"/>
+          <w:bottom w:val="single" w:sz="0" w:space="0" w:color="auto"/>
         </w:tcBorders>
         <w:vAlign w:val="bottom"/>
       </w:tcPr>
     </w:tblStylePr>
   </w:style>
-  <w:style w:customStyle="1" w:styleId="DefinitionTerm" w:type="paragraph">
+  <w:style w:type="paragraph" w:customStyle="1" w:styleId="DefinitionTerm">
     <w:name w:val="Definition Term"/>
     <w:basedOn w:val="Normal"/>
     <w:next w:val="Definition"/>
@@ -1870,75 +2251,76 @@
       <w:b/>
     </w:rPr>
   </w:style>
-  <w:style w:customStyle="1" w:styleId="Definition" w:type="paragraph">
+  <w:style w:type="paragraph" w:customStyle="1" w:styleId="Definition">
     <w:name w:val="Definition"/>
     <w:basedOn w:val="Normal"/>
   </w:style>
-  <w:style w:styleId="Caption" w:type="paragraph">
-    <w:name w:val="Caption"/>
+  <w:style w:type="paragraph" w:styleId="Caption">
+    <w:name w:val="caption"/>
     <w:basedOn w:val="Normal"/>
-    <w:link w:val="BodyTextChar"/>
+    <w:link w:val="CaptionChar"/>
     <w:pPr>
-      <w:spacing w:after="120" w:before="0"/>
+      <w:spacing w:after="120"/>
     </w:pPr>
     <w:rPr>
       <w:i/>
     </w:rPr>
   </w:style>
-  <w:style w:customStyle="1" w:styleId="TableCaption" w:type="paragraph">
+  <w:style w:type="paragraph" w:customStyle="1" w:styleId="TableCaption">
     <w:name w:val="Table Caption"/>
     <w:basedOn w:val="Caption"/>
     <w:pPr>
       <w:keepNext/>
     </w:pPr>
   </w:style>
-  <w:style w:customStyle="1" w:styleId="ImageCaption" w:type="paragraph">
+  <w:style w:type="paragraph" w:customStyle="1" w:styleId="ImageCaption">
     <w:name w:val="Image Caption"/>
     <w:basedOn w:val="Caption"/>
   </w:style>
-  <w:style w:customStyle="1" w:styleId="Figure" w:type="paragraph">
+  <w:style w:type="paragraph" w:customStyle="1" w:styleId="Figure">
     <w:name w:val="Figure"/>
     <w:basedOn w:val="Normal"/>
   </w:style>
-  <w:style w:customStyle="1" w:styleId="CaptionedFigure" w:type="paragraph">
+  <w:style w:type="paragraph" w:customStyle="1" w:styleId="CaptionedFigure">
     <w:name w:val="Captioned Figure"/>
     <w:basedOn w:val="Figure"/>
     <w:pPr>
       <w:keepNext/>
     </w:pPr>
   </w:style>
-  <w:style w:customStyle="1" w:styleId="BodyTextChar" w:type="character">
-    <w:name w:val="Body Text Char"/>
+  <w:style w:type="character" w:customStyle="1" w:styleId="CaptionChar">
+    <w:name w:val="Caption Char"/>
     <w:basedOn w:val="DefaultParagraphFont"/>
-    <w:link w:val="BodyText"/>
-  </w:style>
-  <w:style w:customStyle="1" w:styleId="VerbatimChar" w:type="character">
+    <w:link w:val="Caption"/>
+  </w:style>
+  <w:style w:type="character" w:customStyle="1" w:styleId="VerbatimChar">
     <w:name w:val="Verbatim Char"/>
-    <w:basedOn w:val="BodyTextChar"/>
-    <w:rPr>
-      <w:rFonts w:ascii="Consolas" w:hAnsi="Consolas"/>
-      <w:sz w:val="22"/>
-    </w:rPr>
-  </w:style>
-  <w:style w:customStyle="1" w:styleId="SectionNumber" w:type="character">
+    <w:basedOn w:val="CaptionChar"/>
+    <w:link w:val="SourceCode"/>
+    <w:rPr>
+      <w:rFonts w:ascii="Consolas" w:hAnsi="Consolas"/>
+      <w:sz w:val="22"/>
+    </w:rPr>
+  </w:style>
+  <w:style w:type="character" w:customStyle="1" w:styleId="SectionNumber">
     <w:name w:val="Section Number"/>
-    <w:basedOn w:val="BodyTextChar"/>
-  </w:style>
-  <w:style w:styleId="FootnoteReference" w:type="character">
-    <w:name w:val="Footnote Reference"/>
-    <w:basedOn w:val="BodyTextChar"/>
+    <w:basedOn w:val="CaptionChar"/>
+  </w:style>
+  <w:style w:type="character" w:styleId="FootnoteReference">
+    <w:name w:val="footnote reference"/>
+    <w:basedOn w:val="CaptionChar"/>
     <w:rPr>
       <w:vertAlign w:val="superscript"/>
     </w:rPr>
   </w:style>
-  <w:style w:styleId="Hyperlink" w:type="character">
+  <w:style w:type="character" w:styleId="Hyperlink">
     <w:name w:val="Hyperlink"/>
-    <w:basedOn w:val="BodyTextChar"/>
-    <w:rPr>
-      <w:color w:themeColor="accent1" w:val="4F81BD"/>
-    </w:rPr>
-  </w:style>
-  <w:style w:styleId="TOCHeading" w:type="paragraph">
+    <w:basedOn w:val="CaptionChar"/>
+    <w:rPr>
+      <w:color w:val="156082" w:themeColor="accent1"/>
+    </w:rPr>
+  </w:style>
+  <w:style w:type="paragraph" w:styleId="TOCHeading">
     <w:name w:val="TOC Heading"/>
     <w:basedOn w:val="Heading1"/>
     <w:next w:val="BodyText"/>
@@ -1949,246 +2331,305 @@
       <w:spacing w:before="240" w:line="259" w:lineRule="auto"/>
       <w:outlineLvl w:val="9"/>
     </w:pPr>
-    <w:rPr>
-      <w:rFonts w:asciiTheme="majorHAnsi" w:cstheme="majorBidi" w:eastAsiaTheme="majorEastAsia" w:hAnsiTheme="majorHAnsi"/>
-      <w:b w:val="0"/>
-      <w:bCs w:val="0"/>
-      <w:color w:themeColor="accent1" w:themeShade="BF" w:val="365F91"/>
-    </w:rPr>
   </w:style>
   <w:style w:type="paragraph" w:customStyle="1" w:styleId="SourceCode">
     <w:name w:val="Source Code"/>
     <w:basedOn w:val="Normal"/>
     <w:link w:val="VerbatimChar"/>
     <w:pPr>
-      <w:wordWrap w:val="off"/>
+      <w:wordWrap w:val="0"/>
     </w:pPr>
   </w:style>
   <w:style w:type="character" w:customStyle="1" w:styleId="KeywordTok">
     <w:name w:val="KeywordTok"/>
     <w:basedOn w:val="VerbatimChar"/>
     <w:rPr>
+      <w:rFonts w:ascii="Consolas" w:hAnsi="Consolas"/>
       <w:b/>
       <w:color w:val="007020"/>
+      <w:sz w:val="22"/>
     </w:rPr>
   </w:style>
   <w:style w:type="character" w:customStyle="1" w:styleId="DataTypeTok">
     <w:name w:val="DataTypeTok"/>
     <w:basedOn w:val="VerbatimChar"/>
     <w:rPr>
+      <w:rFonts w:ascii="Consolas" w:hAnsi="Consolas"/>
       <w:color w:val="902000"/>
+      <w:sz w:val="22"/>
     </w:rPr>
   </w:style>
   <w:style w:type="character" w:customStyle="1" w:styleId="DecValTok">
     <w:name w:val="DecValTok"/>
     <w:basedOn w:val="VerbatimChar"/>
     <w:rPr>
-      <w:color w:val="40a070"/>
+      <w:rFonts w:ascii="Consolas" w:hAnsi="Consolas"/>
+      <w:color w:val="40A070"/>
+      <w:sz w:val="22"/>
     </w:rPr>
   </w:style>
   <w:style w:type="character" w:customStyle="1" w:styleId="BaseNTok">
     <w:name w:val="BaseNTok"/>
     <w:basedOn w:val="VerbatimChar"/>
     <w:rPr>
-      <w:color w:val="40a070"/>
+      <w:rFonts w:ascii="Consolas" w:hAnsi="Consolas"/>
+      <w:color w:val="40A070"/>
+      <w:sz w:val="22"/>
     </w:rPr>
   </w:style>
   <w:style w:type="character" w:customStyle="1" w:styleId="FloatTok">
     <w:name w:val="FloatTok"/>
     <w:basedOn w:val="VerbatimChar"/>
     <w:rPr>
-      <w:color w:val="40a070"/>
+      <w:rFonts w:ascii="Consolas" w:hAnsi="Consolas"/>
+      <w:color w:val="40A070"/>
+      <w:sz w:val="22"/>
     </w:rPr>
   </w:style>
   <w:style w:type="character" w:customStyle="1" w:styleId="ConstantTok">
     <w:name w:val="ConstantTok"/>
     <w:basedOn w:val="VerbatimChar"/>
     <w:rPr>
+      <w:rFonts w:ascii="Consolas" w:hAnsi="Consolas"/>
       <w:color w:val="880000"/>
+      <w:sz w:val="22"/>
     </w:rPr>
   </w:style>
   <w:style w:type="character" w:customStyle="1" w:styleId="CharTok">
     <w:name w:val="CharTok"/>
     <w:basedOn w:val="VerbatimChar"/>
     <w:rPr>
-      <w:color w:val="4070a0"/>
+      <w:rFonts w:ascii="Consolas" w:hAnsi="Consolas"/>
+      <w:color w:val="4070A0"/>
+      <w:sz w:val="22"/>
     </w:rPr>
   </w:style>
   <w:style w:type="character" w:customStyle="1" w:styleId="SpecialCharTok">
     <w:name w:val="SpecialCharTok"/>
     <w:basedOn w:val="VerbatimChar"/>
     <w:rPr>
-      <w:color w:val="4070a0"/>
+      <w:rFonts w:ascii="Consolas" w:hAnsi="Consolas"/>
+      <w:color w:val="4070A0"/>
+      <w:sz w:val="22"/>
     </w:rPr>
   </w:style>
   <w:style w:type="character" w:customStyle="1" w:styleId="StringTok">
     <w:name w:val="StringTok"/>
     <w:basedOn w:val="VerbatimChar"/>
     <w:rPr>
-      <w:color w:val="4070a0"/>
+      <w:rFonts w:ascii="Consolas" w:hAnsi="Consolas"/>
+      <w:color w:val="4070A0"/>
+      <w:sz w:val="22"/>
     </w:rPr>
   </w:style>
   <w:style w:type="character" w:customStyle="1" w:styleId="VerbatimStringTok">
     <w:name w:val="VerbatimStringTok"/>
     <w:basedOn w:val="VerbatimChar"/>
     <w:rPr>
-      <w:color w:val="4070a0"/>
+      <w:rFonts w:ascii="Consolas" w:hAnsi="Consolas"/>
+      <w:color w:val="4070A0"/>
+      <w:sz w:val="22"/>
     </w:rPr>
   </w:style>
   <w:style w:type="character" w:customStyle="1" w:styleId="SpecialStringTok">
     <w:name w:val="SpecialStringTok"/>
     <w:basedOn w:val="VerbatimChar"/>
     <w:rPr>
-      <w:color w:val="bb6688"/>
+      <w:rFonts w:ascii="Consolas" w:hAnsi="Consolas"/>
+      <w:color w:val="BB6688"/>
+      <w:sz w:val="22"/>
     </w:rPr>
   </w:style>
   <w:style w:type="character" w:customStyle="1" w:styleId="ImportTok">
     <w:name w:val="ImportTok"/>
     <w:basedOn w:val="VerbatimChar"/>
     <w:rPr>
+      <w:rFonts w:ascii="Consolas" w:hAnsi="Consolas"/>
       <w:b/>
       <w:color w:val="008000"/>
+      <w:sz w:val="22"/>
     </w:rPr>
   </w:style>
   <w:style w:type="character" w:customStyle="1" w:styleId="CommentTok">
     <w:name w:val="CommentTok"/>
     <w:basedOn w:val="VerbatimChar"/>
     <w:rPr>
+      <w:rFonts w:ascii="Consolas" w:hAnsi="Consolas"/>
       <w:i/>
-      <w:color w:val="60a0b0"/>
+      <w:color w:val="60A0B0"/>
+      <w:sz w:val="22"/>
     </w:rPr>
   </w:style>
   <w:style w:type="character" w:customStyle="1" w:styleId="DocumentationTok">
     <w:name w:val="DocumentationTok"/>
     <w:basedOn w:val="VerbatimChar"/>
     <w:rPr>
+      <w:rFonts w:ascii="Consolas" w:hAnsi="Consolas"/>
       <w:i/>
-      <w:color w:val="ba2121"/>
+      <w:color w:val="BA2121"/>
+      <w:sz w:val="22"/>
     </w:rPr>
   </w:style>
   <w:style w:type="character" w:customStyle="1" w:styleId="AnnotationTok">
     <w:name w:val="AnnotationTok"/>
     <w:basedOn w:val="VerbatimChar"/>
     <w:rPr>
+      <w:rFonts w:ascii="Consolas" w:hAnsi="Consolas"/>
       <w:b/>
       <w:i/>
-      <w:color w:val="60a0b0"/>
+      <w:color w:val="60A0B0"/>
+      <w:sz w:val="22"/>
     </w:rPr>
   </w:style>
   <w:style w:type="character" w:customStyle="1" w:styleId="CommentVarTok">
     <w:name w:val="CommentVarTok"/>
     <w:basedOn w:val="VerbatimChar"/>
     <w:rPr>
+      <w:rFonts w:ascii="Consolas" w:hAnsi="Consolas"/>
       <w:b/>
       <w:i/>
-      <w:color w:val="60a0b0"/>
+      <w:color w:val="60A0B0"/>
+      <w:sz w:val="22"/>
     </w:rPr>
   </w:style>
   <w:style w:type="character" w:customStyle="1" w:styleId="OtherTok">
     <w:name w:val="OtherTok"/>
     <w:basedOn w:val="VerbatimChar"/>
     <w:rPr>
+      <w:rFonts w:ascii="Consolas" w:hAnsi="Consolas"/>
       <w:color w:val="007020"/>
+      <w:sz w:val="22"/>
     </w:rPr>
   </w:style>
   <w:style w:type="character" w:customStyle="1" w:styleId="FunctionTok">
     <w:name w:val="FunctionTok"/>
     <w:basedOn w:val="VerbatimChar"/>
     <w:rPr>
-      <w:color w:val="06287e"/>
+      <w:rFonts w:ascii="Consolas" w:hAnsi="Consolas"/>
+      <w:color w:val="06287E"/>
+      <w:sz w:val="22"/>
     </w:rPr>
   </w:style>
   <w:style w:type="character" w:customStyle="1" w:styleId="VariableTok">
     <w:name w:val="VariableTok"/>
     <w:basedOn w:val="VerbatimChar"/>
     <w:rPr>
-      <w:color w:val="19177c"/>
+      <w:rFonts w:ascii="Consolas" w:hAnsi="Consolas"/>
+      <w:color w:val="19177C"/>
+      <w:sz w:val="22"/>
     </w:rPr>
   </w:style>
   <w:style w:type="character" w:customStyle="1" w:styleId="ControlFlowTok">
     <w:name w:val="ControlFlowTok"/>
     <w:basedOn w:val="VerbatimChar"/>
     <w:rPr>
+      <w:rFonts w:ascii="Consolas" w:hAnsi="Consolas"/>
       <w:b/>
       <w:color w:val="007020"/>
+      <w:sz w:val="22"/>
     </w:rPr>
   </w:style>
   <w:style w:type="character" w:customStyle="1" w:styleId="OperatorTok">
     <w:name w:val="OperatorTok"/>
     <w:basedOn w:val="VerbatimChar"/>
     <w:rPr>
+      <w:rFonts w:ascii="Consolas" w:hAnsi="Consolas"/>
       <w:color w:val="666666"/>
+      <w:sz w:val="22"/>
     </w:rPr>
   </w:style>
   <w:style w:type="character" w:customStyle="1" w:styleId="BuiltInTok">
     <w:name w:val="BuiltInTok"/>
     <w:basedOn w:val="VerbatimChar"/>
     <w:rPr>
+      <w:rFonts w:ascii="Consolas" w:hAnsi="Consolas"/>
       <w:color w:val="008000"/>
+      <w:sz w:val="22"/>
     </w:rPr>
   </w:style>
   <w:style w:type="character" w:customStyle="1" w:styleId="ExtensionTok">
     <w:name w:val="ExtensionTok"/>
     <w:basedOn w:val="VerbatimChar"/>
-    <w:rPr/>
+    <w:rPr>
+      <w:rFonts w:ascii="Consolas" w:hAnsi="Consolas"/>
+      <w:sz w:val="22"/>
+    </w:rPr>
   </w:style>
   <w:style w:type="character" w:customStyle="1" w:styleId="PreprocessorTok">
     <w:name w:val="PreprocessorTok"/>
     <w:basedOn w:val="VerbatimChar"/>
     <w:rPr>
-      <w:color w:val="bc7a00"/>
+      <w:rFonts w:ascii="Consolas" w:hAnsi="Consolas"/>
+      <w:color w:val="BC7A00"/>
+      <w:sz w:val="22"/>
     </w:rPr>
   </w:style>
   <w:style w:type="character" w:customStyle="1" w:styleId="AttributeTok">
     <w:name w:val="AttributeTok"/>
     <w:basedOn w:val="VerbatimChar"/>
     <w:rPr>
-      <w:color w:val="7d9029"/>
+      <w:rFonts w:ascii="Consolas" w:hAnsi="Consolas"/>
+      <w:color w:val="7D9029"/>
+      <w:sz w:val="22"/>
     </w:rPr>
   </w:style>
   <w:style w:type="character" w:customStyle="1" w:styleId="RegionMarkerTok">
     <w:name w:val="RegionMarkerTok"/>
     <w:basedOn w:val="VerbatimChar"/>
-    <w:rPr/>
+    <w:rPr>
+      <w:rFonts w:ascii="Consolas" w:hAnsi="Consolas"/>
+      <w:sz w:val="22"/>
+    </w:rPr>
   </w:style>
   <w:style w:type="character" w:customStyle="1" w:styleId="InformationTok">
     <w:name w:val="InformationTok"/>
     <w:basedOn w:val="VerbatimChar"/>
     <w:rPr>
+      <w:rFonts w:ascii="Consolas" w:hAnsi="Consolas"/>
       <w:b/>
       <w:i/>
-      <w:color w:val="60a0b0"/>
+      <w:color w:val="60A0B0"/>
+      <w:sz w:val="22"/>
     </w:rPr>
   </w:style>
   <w:style w:type="character" w:customStyle="1" w:styleId="WarningTok">
     <w:name w:val="WarningTok"/>
     <w:basedOn w:val="VerbatimChar"/>
     <w:rPr>
+      <w:rFonts w:ascii="Consolas" w:hAnsi="Consolas"/>
       <w:b/>
       <w:i/>
-      <w:color w:val="60a0b0"/>
+      <w:color w:val="60A0B0"/>
+      <w:sz w:val="22"/>
     </w:rPr>
   </w:style>
   <w:style w:type="character" w:customStyle="1" w:styleId="AlertTok">
     <w:name w:val="AlertTok"/>
     <w:basedOn w:val="VerbatimChar"/>
     <w:rPr>
+      <w:rFonts w:ascii="Consolas" w:hAnsi="Consolas"/>
       <w:b/>
-      <w:color w:val="ff0000"/>
+      <w:color w:val="FF0000"/>
+      <w:sz w:val="22"/>
     </w:rPr>
   </w:style>
   <w:style w:type="character" w:customStyle="1" w:styleId="ErrorTok">
     <w:name w:val="ErrorTok"/>
     <w:basedOn w:val="VerbatimChar"/>
     <w:rPr>
+      <w:rFonts w:ascii="Consolas" w:hAnsi="Consolas"/>
       <w:b/>
-      <w:color w:val="ff0000"/>
+      <w:color w:val="FF0000"/>
+      <w:sz w:val="22"/>
     </w:rPr>
   </w:style>
   <w:style w:type="character" w:customStyle="1" w:styleId="NormalTok">
     <w:name w:val="NormalTok"/>
     <w:basedOn w:val="VerbatimChar"/>
-    <w:rPr/>
+    <w:rPr>
+      <w:rFonts w:ascii="Consolas" w:hAnsi="Consolas"/>
+      <w:sz w:val="22"/>
+    </w:rPr>
   </w:style>
 </w:styles>
 </file>

</xml_diff>

<commit_message>
feat: add mouse maze and evidence capture workflow
</commit_message>
<xml_diff>
--- a/output/doc/2026-07-13-microsoft-medical-emoji-decision-brief.docx
+++ b/output/doc/2026-07-13-microsoft-medical-emoji-decision-brief.docx
@@ -149,7 +149,7 @@
         <w:pStyle w:val="BodyText"/>
       </w:pPr>
       <w:r>
-        <w:t xml:space="preserve">Ultrasound is the highest-upside concept found in the expanded review. No matching proposal appears in Unicode’s public status sheet, its recent Google Books signal is approximately </w:t>
+        <w:t xml:space="preserve">Ultrasound is the highest-upside concept found in the expanded review. No matching proposal appears in Unicode's public status sheet, its recent Google Books signal is approximately </w:t>
       </w:r>
       <w:r>
         <w:rPr>
@@ -159,7 +159,7 @@
         <w:t>1.70 times</w:t>
       </w:r>
       <w:r>
-        <w:t xml:space="preserve"> Unicode’s </w:t>
+        <w:t xml:space="preserve"> Unicode's </w:t>
       </w:r>
       <w:r>
         <w:rPr>
@@ -206,16 +206,15 @@
     <w:tbl>
       <w:tblPr>
         <w:tblStyle w:val="Table"/>
-        <w:tblW w:w="5000" w:type="pct"/>
-        <w:tblLayout w:type="fixed"/>
+        <w:tblW w:w="0" w:type="auto"/>
         <w:tblLook w:val="0020" w:firstRow="1" w:lastRow="0" w:firstColumn="0" w:lastColumn="0" w:noHBand="0" w:noVBand="0"/>
       </w:tblPr>
       <w:tblGrid>
-        <w:gridCol w:w="1916"/>
-        <w:gridCol w:w="1915"/>
-        <w:gridCol w:w="1915"/>
-        <w:gridCol w:w="1915"/>
-        <w:gridCol w:w="1915"/>
+        <w:gridCol w:w="1378"/>
+        <w:gridCol w:w="1545"/>
+        <w:gridCol w:w="2849"/>
+        <w:gridCol w:w="2165"/>
+        <w:gridCol w:w="1639"/>
       </w:tblGrid>
       <w:tr>
         <w:trPr>
@@ -224,7 +223,7 @@
         </w:trPr>
         <w:tc>
           <w:tcPr>
-            <w:tcW w:w="1584" w:type="dxa"/>
+            <w:tcW w:w="0" w:type="auto"/>
           </w:tcPr>
           <w:p>
             <w:pPr>
@@ -237,7 +236,7 @@
         </w:tc>
         <w:tc>
           <w:tcPr>
-            <w:tcW w:w="1584" w:type="dxa"/>
+            <w:tcW w:w="0" w:type="auto"/>
           </w:tcPr>
           <w:p>
             <w:pPr>
@@ -250,7 +249,7 @@
         </w:tc>
         <w:tc>
           <w:tcPr>
-            <w:tcW w:w="1584" w:type="dxa"/>
+            <w:tcW w:w="0" w:type="auto"/>
           </w:tcPr>
           <w:p>
             <w:pPr>
@@ -263,7 +262,7 @@
         </w:tc>
         <w:tc>
           <w:tcPr>
-            <w:tcW w:w="1584" w:type="dxa"/>
+            <w:tcW w:w="0" w:type="auto"/>
           </w:tcPr>
           <w:p>
             <w:pPr>
@@ -276,7 +275,7 @@
         </w:tc>
         <w:tc>
           <w:tcPr>
-            <w:tcW w:w="1584" w:type="dxa"/>
+            <w:tcW w:w="0" w:type="auto"/>
           </w:tcPr>
           <w:p>
             <w:pPr>
@@ -291,7 +290,7 @@
       <w:tr>
         <w:tc>
           <w:tcPr>
-            <w:tcW w:w="1584" w:type="dxa"/>
+            <w:tcW w:w="0" w:type="auto"/>
           </w:tcPr>
           <w:p>
             <w:pPr>
@@ -304,7 +303,7 @@
         </w:tc>
         <w:tc>
           <w:tcPr>
-            <w:tcW w:w="1584" w:type="dxa"/>
+            <w:tcW w:w="0" w:type="auto"/>
           </w:tcPr>
           <w:p>
             <w:pPr>
@@ -317,7 +316,7 @@
         </w:tc>
         <w:tc>
           <w:tcPr>
-            <w:tcW w:w="1584" w:type="dxa"/>
+            <w:tcW w:w="0" w:type="auto"/>
           </w:tcPr>
           <w:p>
             <w:pPr>
@@ -339,7 +338,7 @@
         </w:tc>
         <w:tc>
           <w:tcPr>
-            <w:tcW w:w="1584" w:type="dxa"/>
+            <w:tcW w:w="0" w:type="auto"/>
           </w:tcPr>
           <w:p>
             <w:pPr>
@@ -352,7 +351,7 @@
         </w:tc>
         <w:tc>
           <w:tcPr>
-            <w:tcW w:w="1584" w:type="dxa"/>
+            <w:tcW w:w="0" w:type="auto"/>
           </w:tcPr>
           <w:p>
             <w:pPr>
@@ -371,7 +370,7 @@
       <w:tr>
         <w:tc>
           <w:tcPr>
-            <w:tcW w:w="1584" w:type="dxa"/>
+            <w:tcW w:w="0" w:type="auto"/>
           </w:tcPr>
           <w:p>
             <w:pPr>
@@ -384,7 +383,7 @@
         </w:tc>
         <w:tc>
           <w:tcPr>
-            <w:tcW w:w="1584" w:type="dxa"/>
+            <w:tcW w:w="0" w:type="auto"/>
           </w:tcPr>
           <w:p>
             <w:pPr>
@@ -397,7 +396,7 @@
         </w:tc>
         <w:tc>
           <w:tcPr>
-            <w:tcW w:w="1584" w:type="dxa"/>
+            <w:tcW w:w="0" w:type="auto"/>
           </w:tcPr>
           <w:p>
             <w:pPr>
@@ -410,7 +409,7 @@
         </w:tc>
         <w:tc>
           <w:tcPr>
-            <w:tcW w:w="1584" w:type="dxa"/>
+            <w:tcW w:w="0" w:type="auto"/>
           </w:tcPr>
           <w:p>
             <w:pPr>
@@ -423,7 +422,7 @@
         </w:tc>
         <w:tc>
           <w:tcPr>
-            <w:tcW w:w="1584" w:type="dxa"/>
+            <w:tcW w:w="0" w:type="auto"/>
           </w:tcPr>
           <w:p>
             <w:pPr>
@@ -442,7 +441,7 @@
       <w:tr>
         <w:tc>
           <w:tcPr>
-            <w:tcW w:w="1584" w:type="dxa"/>
+            <w:tcW w:w="0" w:type="auto"/>
           </w:tcPr>
           <w:p>
             <w:pPr>
@@ -455,7 +454,7 @@
         </w:tc>
         <w:tc>
           <w:tcPr>
-            <w:tcW w:w="1584" w:type="dxa"/>
+            <w:tcW w:w="0" w:type="auto"/>
           </w:tcPr>
           <w:p>
             <w:pPr>
@@ -468,20 +467,20 @@
         </w:tc>
         <w:tc>
           <w:tcPr>
-            <w:tcW w:w="1584" w:type="dxa"/>
+            <w:tcW w:w="0" w:type="auto"/>
           </w:tcPr>
           <w:p>
             <w:pPr>
               <w:pStyle w:val="Compact"/>
             </w:pPr>
             <w:r>
-              <w:t>Broad puzzle, path, choice, complexity, and navigation meanings</w:t>
+              <w:t>Mouse-maze paradigm; puzzle, learning, memory, research, and navigation uses</w:t>
             </w:r>
           </w:p>
         </w:tc>
         <w:tc>
           <w:tcPr>
-            <w:tcW w:w="1584" w:type="dxa"/>
+            <w:tcW w:w="0" w:type="auto"/>
           </w:tcPr>
           <w:p>
             <w:pPr>
@@ -500,7 +499,7 @@
         </w:tc>
         <w:tc>
           <w:tcPr>
-            <w:tcW w:w="1584" w:type="dxa"/>
+            <w:tcW w:w="0" w:type="auto"/>
           </w:tcPr>
           <w:p>
             <w:pPr>
@@ -515,7 +514,7 @@
       <w:tr>
         <w:tc>
           <w:tcPr>
-            <w:tcW w:w="1584" w:type="dxa"/>
+            <w:tcW w:w="0" w:type="auto"/>
           </w:tcPr>
           <w:p>
             <w:pPr>
@@ -528,7 +527,7 @@
         </w:tc>
         <w:tc>
           <w:tcPr>
-            <w:tcW w:w="1584" w:type="dxa"/>
+            <w:tcW w:w="0" w:type="auto"/>
           </w:tcPr>
           <w:p>
             <w:pPr>
@@ -541,7 +540,7 @@
         </w:tc>
         <w:tc>
           <w:tcPr>
-            <w:tcW w:w="1584" w:type="dxa"/>
+            <w:tcW w:w="0" w:type="auto"/>
           </w:tcPr>
           <w:p>
             <w:pPr>
@@ -554,7 +553,7 @@
         </w:tc>
         <w:tc>
           <w:tcPr>
-            <w:tcW w:w="1584" w:type="dxa"/>
+            <w:tcW w:w="0" w:type="auto"/>
           </w:tcPr>
           <w:p>
             <w:pPr>
@@ -567,7 +566,7 @@
         </w:tc>
         <w:tc>
           <w:tcPr>
-            <w:tcW w:w="1584" w:type="dxa"/>
+            <w:tcW w:w="0" w:type="auto"/>
           </w:tcPr>
           <w:p>
             <w:pPr>
@@ -640,7 +639,10 @@
         <w:t>Evidence owner and Shuhan He - July 15:</w:t>
       </w:r>
       <w:r>
-        <w:t xml:space="preserve"> capture all four missing Ultrasound screenshots and issue a pass/fail note.</w:t>
+        <w:t xml:space="preserve"> run the Google helper from an accepted Microsoft or residential </w:t>
+      </w:r>
+      <w:r>
+        <w:t>network, capture all four missing Ultrasound screenshots, and issue a pass/fail note.</w:t>
       </w:r>
     </w:p>
     <w:p>
@@ -656,10 +658,10 @@
           <w:b/>
           <w:bCs/>
         </w:rPr>
-        <w:t>Windows/Segoe UI Emoji and Fluent Emoji - July 17:</w:t>
-      </w:r>
-      <w:r>
-        <w:t xml:space="preserve"> accept the 18x18 Ultrasound probe or select CT Scan.</w:t>
+        <w:t>Bing Search owner - July 16, only if Google remains inaccessible:</w:t>
+      </w:r>
+      <w:r>
+        <w:t xml:space="preserve"> identify a public, reproducible Web, Video, Web-trend, and Image-trend method comparable to Google's categories. Do not substitute private telemetry or the three-image supplement without standards review.</w:t>
       </w:r>
     </w:p>
     <w:p>
@@ -675,10 +677,10 @@
           <w:b/>
           <w:bCs/>
         </w:rPr>
-        <w:t>Microsoft Legal - July 20:</w:t>
-      </w:r>
-      <w:r>
-        <w:t xml:space="preserve"> clear the CC0 artwork route and final anticipated-implementation statement.</w:t>
+        <w:t>Windows/Segoe UI Emoji and Fluent Emoji - July 17:</w:t>
+      </w:r>
+      <w:r>
+        <w:t xml:space="preserve"> accept the 18x18 Ultrasound probe or select CT Scan.</w:t>
       </w:r>
     </w:p>
     <w:p>
@@ -694,6 +696,28 @@
           <w:b/>
           <w:bCs/>
         </w:rPr>
+        <w:t>Microsoft Legal - July 20:</w:t>
+      </w:r>
+      <w:r>
+        <w:t xml:space="preserve"> </w:t>
+      </w:r>
+      <w:r>
+        <w:t>clear the CC0 artwork route and final anticipated-implementation statement.</w:t>
+      </w:r>
+    </w:p>
+    <w:p>
+      <w:pPr>
+        <w:pStyle w:val="Compact"/>
+        <w:numPr>
+          <w:ilvl w:val="0"/>
+          <w:numId w:val="2"/>
+        </w:numPr>
+      </w:pPr>
+      <w:r>
+        <w:rPr>
+          <w:b/>
+          <w:bCs/>
+        </w:rPr>
         <w:t>David Rhew and Shuhan He - July 31:</w:t>
       </w:r>
       <w:r>
@@ -732,7 +756,7 @@
         </w:numPr>
       </w:pPr>
       <w:r>
-        <w:t>Ask Microsoft’s Unicode contacts about process and venue, never for a preferred technical outcome.</w:t>
+        <w:t>Ask Microsoft's Unicode contacts about process and venue, never for a preferred technical outcome.</w:t>
       </w:r>
     </w:p>
     <w:p>
@@ -780,7 +804,7 @@
         </w:numPr>
       </w:pPr>
       <w:r>
-        <w:t>Maze must be framed as a general puzzle and navigation object, not as a neuroscience-awareness cause.</w:t>
+        <w:t>Maze uses a mouse-maze paradigm; justify it through concrete puzzle, learning, memory, navigation, and research uses, not an awareness cause.</w:t>
       </w:r>
     </w:p>
     <w:p>
@@ -850,7 +874,7 @@
         </w:numPr>
       </w:pPr>
       <w:r>
-        <w:t>Comparative ranking and independent drafts across the twelve-concept expanded portfolio.</w:t>
+        <w:t>Reproducible Bing Web/Video/Image supplements for all three evidence-gated drafts, explicitly separated from the still-missing Google categories.</w:t>
       </w:r>
     </w:p>
     <w:p>
@@ -862,6 +886,18 @@
         </w:numPr>
       </w:pPr>
       <w:r>
+        <w:t>Comparative ranking and independent drafts across the twelve-concept expanded portfolio.</w:t>
+      </w:r>
+    </w:p>
+    <w:p>
+      <w:pPr>
+        <w:pStyle w:val="Compact"/>
+        <w:numPr>
+          <w:ilvl w:val="0"/>
+          <w:numId w:val="4"/>
+        </w:numPr>
+      </w:pPr>
+      <w:r>
         <w:t>Original color and black-and-white SVG/PNG artwork released under CC0 1.0.</w:t>
       </w:r>
     </w:p>
@@ -877,9 +913,14 @@
       <w:pPr>
         <w:pStyle w:val="BodyText"/>
       </w:pPr>
-      <w:r>
-        <w:t>https://github.com/ShuhanCS/medicalemoji/tree/codex/eligible-2026-slate/submissions/v1.4.0</w:t>
-      </w:r>
+      <w:hyperlink r:id="rId5">
+        <w:r>
+          <w:rPr>
+            <w:rStyle w:val="Hyperlink"/>
+          </w:rPr>
+          <w:t>https://github.com/ShuhanCS/medicalemoji/tree/codex/eligible-2026-slate/submissions/v1.5.0</w:t>
+        </w:r>
+      </w:hyperlink>
     </w:p>
     <w:p>
       <w:pPr>
@@ -893,9 +934,14 @@
       <w:pPr>
         <w:pStyle w:val="BodyText"/>
       </w:pPr>
-      <w:r>
-        <w:t>https://github.com/ShuhanCS/medicalemoji/tree/codex/eligible-2026-slate/submissions/v1.3.0/ct-scan</w:t>
-      </w:r>
+      <w:hyperlink r:id="rId6">
+        <w:r>
+          <w:rPr>
+            <w:rStyle w:val="Hyperlink"/>
+          </w:rPr>
+          <w:t>https://github.com/ShuhanCS/medicalemoji/tree/codex/eligible-2026-slate/submissions/v1.3.0/ct-scan</w:t>
+        </w:r>
+      </w:hyperlink>
     </w:p>
     <w:p>
       <w:pPr>
@@ -916,8 +962,16 @@
         </w:numPr>
       </w:pPr>
       <w:r>
-        <w:t>Unicode proposal guidance: https://www.unicode.org/emoji/proposals.html</w:t>
-      </w:r>
+        <w:t xml:space="preserve">Unicode proposal guidance: </w:t>
+      </w:r>
+      <w:hyperlink r:id="rId7">
+        <w:r>
+          <w:rPr>
+            <w:rStyle w:val="Hyperlink"/>
+          </w:rPr>
+          <w:t>https://www.unicode.org/emoji/proposals.html</w:t>
+        </w:r>
+      </w:hyperlink>
     </w:p>
     <w:p>
       <w:pPr>
@@ -928,32 +982,16 @@
         </w:numPr>
       </w:pPr>
       <w:r>
-        <w:t>Unicode Emoji Submission FAQ: https://www.unicode.org/faq/emoji_submission.html</w:t>
-      </w:r>
-    </w:p>
-    <w:p>
-      <w:pPr>
-        <w:pStyle w:val="Compact"/>
-        <w:numPr>
-          <w:ilvl w:val="0"/>
-          <w:numId w:val="5"/>
-        </w:numPr>
-      </w:pPr>
-      <w:r>
-        <w:t>Unicode proposal status: https://www.unicode.org/emoji/emoji-proposals-status.html</w:t>
-      </w:r>
-    </w:p>
-    <w:p>
-      <w:pPr>
-        <w:pStyle w:val="Compact"/>
-        <w:numPr>
-          <w:ilvl w:val="0"/>
-          <w:numId w:val="5"/>
-        </w:numPr>
-      </w:pPr>
-      <w:r>
-        <w:t>Microsoft Fluent Emoji: https://github.com/microsoft/fluentui-emoji</w:t>
-      </w:r>
+        <w:t xml:space="preserve">Unicode Emoji Submission FAQ: </w:t>
+      </w:r>
+      <w:hyperlink r:id="rId8">
+        <w:r>
+          <w:rPr>
+            <w:rStyle w:val="Hyperlink"/>
+          </w:rPr>
+          <w:t>https://www.unicode.org/faq/emoji_submission.html</w:t>
+        </w:r>
+      </w:hyperlink>
     </w:p>
     <w:p>
       <w:pPr>
@@ -993,7 +1031,7 @@
         <w:pStyle w:val="BodyText"/>
       </w:pPr>
       <w:r>
-        <w:t xml:space="preserve">Microsoft supports the Unicode Consortium’s consideration of the </w:t>
+        <w:t xml:space="preserve">Microsoft supports the Unicode Consortium's consideration of the </w:t>
       </w:r>
       <w:r>
         <w:rPr>
@@ -1003,7 +1041,10 @@
         <w:t>[Ultrasound / CT Scan - select one]</w:t>
       </w:r>
       <w:r>
-        <w:t xml:space="preserve"> emoji proposal submitted by Shuhan He. If the character is encoded and recommended for general interchange as emoji, Microsoft anticipates implementing it in Segoe UI Emoji and relevant Microsoft emoji experiences through its standard design, product-planning, accessibility, legal, and release processes.</w:t>
+        <w:t xml:space="preserve"> emoji proposal submitted by Shuhan He. If the character is encoded and recommended for general interchange as emoji, Microsoft anticipates implementing it in Segoe UI Emoji and relevant Microsoft emoji experiences </w:t>
+      </w:r>
+      <w:r>
+        <w:t>through its standard design, product-planning, accessibility, legal, and release processes.</w:t>
       </w:r>
     </w:p>
     <w:p>
@@ -1011,7 +1052,7 @@
         <w:pStyle w:val="BodyText"/>
       </w:pPr>
       <w:r>
-        <w:t>Microsoft would retain control of its vendor-specific artwork and implementation schedule. This statement supplies anticipated vendor support; it does not request preferential treatment, pre-judge Unicode’s technical review, or bypass Microsoft’s normal approvals.</w:t>
+        <w:t>Microsoft would retain control of its vendor-specific artwork and implementation schedule. This statement supplies anticipated vendor support; it does not request preferential treatment, pre-judge Unicode's technical review, or bypass Microsoft's normal approvals.</w:t>
       </w:r>
     </w:p>
     <w:p>
@@ -1028,7 +1069,10 @@
         <w:t>Ultrasound</w:t>
       </w:r>
       <w:r>
-        <w:t xml:space="preserve"> only after all four missing Google screenshots are inserted and the design owner approves the monitor-and-probe paradigm. Otherwise select </w:t>
+        <w:t xml:space="preserve"> only after all four missing Google screenshots are inserted and the design owner approves </w:t>
+      </w:r>
+      <w:r>
+        <w:t xml:space="preserve">the monitor-and-probe paradigm. Otherwise select </w:t>
       </w:r>
       <w:r>
         <w:rPr>
@@ -1113,7 +1157,7 @@
   <w:abstractNum w:abstractNumId="0" w15:restartNumberingAfterBreak="0">
     <w:nsid w:val="0000A990"/>
     <w:multiLevelType w:val="multilevel"/>
-    <w:tmpl w:val="D354FB30"/>
+    <w:tmpl w:val="D0DC39EE"/>
     <w:lvl w:ilvl="0">
       <w:numFmt w:val="bullet"/>
       <w:lvlText w:val=" "/>
@@ -1190,7 +1234,7 @@
   <w:abstractNum w:abstractNumId="1" w15:restartNumberingAfterBreak="0">
     <w:nsid w:val="0000A991"/>
     <w:multiLevelType w:val="multilevel"/>
-    <w:tmpl w:val="3EC80656"/>
+    <w:tmpl w:val="9AF2C4B4"/>
     <w:lvl w:ilvl="0">
       <w:numFmt w:val="bullet"/>
       <w:lvlText w:val=""/>
@@ -1294,7 +1338,7 @@
   <w:abstractNum w:abstractNumId="2" w15:restartNumberingAfterBreak="0">
     <w:nsid w:val="00A99411"/>
     <w:multiLevelType w:val="multilevel"/>
-    <w:tmpl w:val="2D14E4EA"/>
+    <w:tmpl w:val="E32CCA6A"/>
     <w:lvl w:ilvl="0">
       <w:start w:val="1"/>
       <w:numFmt w:val="decimal"/>
@@ -1377,10 +1421,10 @@
       </w:pPr>
     </w:lvl>
   </w:abstractNum>
-  <w:num w:numId="1" w16cid:durableId="263849748">
+  <w:num w:numId="1" w16cid:durableId="2054380998">
     <w:abstractNumId w:val="0"/>
   </w:num>
-  <w:num w:numId="2" w16cid:durableId="1208490566">
+  <w:num w:numId="2" w16cid:durableId="1347634067">
     <w:abstractNumId w:val="2"/>
     <w:lvlOverride w:ilvl="0">
       <w:startOverride w:val="1"/>
@@ -1410,13 +1454,13 @@
       <w:startOverride w:val="1"/>
     </w:lvlOverride>
   </w:num>
-  <w:num w:numId="3" w16cid:durableId="1841313775">
+  <w:num w:numId="3" w16cid:durableId="218060088">
     <w:abstractNumId w:val="1"/>
   </w:num>
-  <w:num w:numId="4" w16cid:durableId="1449736571">
+  <w:num w:numId="4" w16cid:durableId="1284196192">
     <w:abstractNumId w:val="1"/>
   </w:num>
-  <w:num w:numId="5" w16cid:durableId="1733653850">
+  <w:num w:numId="5" w16cid:durableId="1157452611">
     <w:abstractNumId w:val="1"/>
   </w:num>
 </w:numbering>

</xml_diff>